<commit_message>
Se agregó información al archivo de ideas
</commit_message>
<xml_diff>
--- a/docs/Especificación de Requisitos - Sistema PA V2.docx
+++ b/docs/Especificación de Requisitos - Sistema PA V2.docx
@@ -739,31 +739,16 @@
     </w:tbl>
     <w:p>
       <w:pPr>
-        <w:widowControl w:val="0"/>
-        <w:pBdr>
-          <w:top w:val="nil"/>
-          <w:left w:val="nil"/>
-          <w:bottom w:val="nil"/>
-          <w:right w:val="nil"/>
-          <w:between w:val="nil"/>
-        </w:pBdr>
-      </w:pPr>
-    </w:p>
-    <w:p>
-      <w:r>
-        <w:pict w14:anchorId="65A69D40">
-          <v:rect id="_x0000_i1025" style="width:0;height:1.5pt" o:hralign="center" o:hrstd="t" o:hr="t" fillcolor="#a0a0a0" stroked="f"/>
-        </w:pict>
-      </w:r>
-    </w:p>
-    <w:p>
-      <w:pPr>
         <w:pStyle w:val="Ttulo2"/>
       </w:pPr>
       <w:bookmarkStart w:id="4" w:name="_g7jffq6exo5p" w:colFirst="0" w:colLast="0"/>
       <w:bookmarkEnd w:id="4"/>
-      <w:r>
-        <w:lastRenderedPageBreak/>
+    </w:p>
+    <w:p>
+      <w:pPr>
+        <w:pStyle w:val="Ttulo2"/>
+      </w:pPr>
+      <w:r>
         <w:t>2. Introducción y Perspectiva del Producto</w:t>
       </w:r>
     </w:p>
@@ -808,6 +793,317 @@
     </w:p>
     <w:p>
       <w:pPr>
+        <w:pStyle w:val="Ttulo2"/>
+      </w:pPr>
+      <w:bookmarkStart w:id="5" w:name="_f8aqb5l8ahs5" w:colFirst="0" w:colLast="0"/>
+      <w:bookmarkEnd w:id="5"/>
+    </w:p>
+    <w:p>
+      <w:pPr>
+        <w:pStyle w:val="Ttulo2"/>
+      </w:pPr>
+      <w:r>
+        <w:t>3. Glosario de Términos</w:t>
+      </w:r>
+    </w:p>
+    <w:p>
+      <w:pPr>
+        <w:numPr>
+          <w:ilvl w:val="0"/>
+          <w:numId w:val="2"/>
+        </w:numPr>
+        <w:spacing w:line="360" w:lineRule="auto"/>
+        <w:jc w:val="both"/>
+      </w:pPr>
+      <w:r>
+        <w:rPr>
+          <w:b/>
+          <w:bCs/>
+        </w:rPr>
+        <w:t>PA:</w:t>
+      </w:r>
+      <w:r>
+        <w:t xml:space="preserve"> Procuraduría Agraria.</w:t>
+      </w:r>
+    </w:p>
+    <w:p>
+      <w:pPr>
+        <w:numPr>
+          <w:ilvl w:val="0"/>
+          <w:numId w:val="2"/>
+        </w:numPr>
+        <w:spacing w:line="360" w:lineRule="auto"/>
+        <w:jc w:val="both"/>
+      </w:pPr>
+      <w:r>
+        <w:rPr>
+          <w:b/>
+          <w:bCs/>
+        </w:rPr>
+        <w:t>Núcleo Agrario / Ejido:</w:t>
+      </w:r>
+      <w:r>
+        <w:t xml:space="preserve"> Entidad territorial (representada como un polígono) que se ve afectada por el paso de la línea del tren.</w:t>
+      </w:r>
+    </w:p>
+    <w:p>
+      <w:pPr>
+        <w:numPr>
+          <w:ilvl w:val="0"/>
+          <w:numId w:val="2"/>
+        </w:numPr>
+        <w:spacing w:line="360" w:lineRule="auto"/>
+        <w:jc w:val="both"/>
+      </w:pPr>
+      <w:r>
+        <w:rPr>
+          <w:b/>
+          <w:bCs/>
+        </w:rPr>
+        <w:t>Tramo:</w:t>
+      </w:r>
+      <w:r>
+        <w:t xml:space="preserve"> Segmentos específicos de la ruta del tren que atraviesan los núcleos agrarios; su unidad de interés para la PA es en kilómetros o metros lineales.</w:t>
+      </w:r>
+    </w:p>
+    <w:p>
+      <w:pPr>
+        <w:numPr>
+          <w:ilvl w:val="0"/>
+          <w:numId w:val="2"/>
+        </w:numPr>
+        <w:spacing w:line="360" w:lineRule="auto"/>
+        <w:jc w:val="both"/>
+      </w:pPr>
+      <w:r>
+        <w:rPr>
+          <w:b/>
+          <w:bCs/>
+        </w:rPr>
+        <w:t>COP:</w:t>
+      </w:r>
+      <w:r>
+        <w:t xml:space="preserve"> Convenio de Ocupación Previa (utilizado en el estatus "Autorización firma de COP").</w:t>
+      </w:r>
+    </w:p>
+    <w:p>
+      <w:pPr>
+        <w:numPr>
+          <w:ilvl w:val="0"/>
+          <w:numId w:val="2"/>
+        </w:numPr>
+        <w:spacing w:line="360" w:lineRule="auto"/>
+        <w:jc w:val="both"/>
+      </w:pPr>
+      <w:r>
+        <w:rPr>
+          <w:b/>
+          <w:bCs/>
+        </w:rPr>
+        <w:t>Frente:</w:t>
+      </w:r>
+      <w:r>
+        <w:t xml:space="preserve"> Entorno de trabajo de campo donde operan técnicos y organizadores.</w:t>
+      </w:r>
+    </w:p>
+    <w:p>
+      <w:pPr>
+        <w:numPr>
+          <w:ilvl w:val="0"/>
+          <w:numId w:val="2"/>
+        </w:numPr>
+        <w:spacing w:line="360" w:lineRule="auto"/>
+        <w:jc w:val="both"/>
+      </w:pPr>
+      <w:r>
+        <w:rPr>
+          <w:b/>
+          <w:bCs/>
+        </w:rPr>
+        <w:t>RAN:</w:t>
+      </w:r>
+      <w:r>
+        <w:t xml:space="preserve"> Registro Agrario Nacional, donde se inscriben los convenios.</w:t>
+      </w:r>
+    </w:p>
+    <w:p>
+      <w:pPr>
+        <w:numPr>
+          <w:ilvl w:val="0"/>
+          <w:numId w:val="2"/>
+        </w:numPr>
+        <w:spacing w:line="360" w:lineRule="auto"/>
+        <w:jc w:val="both"/>
+      </w:pPr>
+    </w:p>
+    <w:p>
+      <w:pPr>
+        <w:pStyle w:val="Ttulo2"/>
+      </w:pPr>
+      <w:bookmarkStart w:id="6" w:name="_3tl3wpe2pvbq" w:colFirst="0" w:colLast="0"/>
+      <w:bookmarkEnd w:id="6"/>
+      <w:r>
+        <w:t>4. Actores del Sistema</w:t>
+      </w:r>
+    </w:p>
+    <w:p>
+      <w:pPr>
+        <w:pStyle w:val="Ttulo3"/>
+      </w:pPr>
+      <w:bookmarkStart w:id="7" w:name="_m8m6uf1is6cy" w:colFirst="0" w:colLast="0"/>
+      <w:bookmarkEnd w:id="7"/>
+      <w:r>
+        <w:t>4.1 Administrador (</w:t>
+      </w:r>
+      <w:proofErr w:type="spellStart"/>
+      <w:r>
+        <w:t>Admin</w:t>
+      </w:r>
+      <w:proofErr w:type="spellEnd"/>
+      <w:r>
+        <w:t>)</w:t>
+      </w:r>
+    </w:p>
+    <w:p>
+      <w:pPr>
+        <w:numPr>
+          <w:ilvl w:val="0"/>
+          <w:numId w:val="2"/>
+        </w:numPr>
+        <w:spacing w:line="360" w:lineRule="auto"/>
+        <w:jc w:val="both"/>
+      </w:pPr>
+      <w:r>
+        <w:t>Acceso total al sistema.</w:t>
+      </w:r>
+    </w:p>
+    <w:p>
+      <w:pPr>
+        <w:numPr>
+          <w:ilvl w:val="0"/>
+          <w:numId w:val="2"/>
+        </w:numPr>
+        <w:spacing w:line="360" w:lineRule="auto"/>
+        <w:jc w:val="both"/>
+      </w:pPr>
+      <w:r>
+        <w:t>Puede visualizar, registrar, modificar y eliminar información.</w:t>
+      </w:r>
+    </w:p>
+    <w:p>
+      <w:pPr>
+        <w:numPr>
+          <w:ilvl w:val="0"/>
+          <w:numId w:val="2"/>
+        </w:numPr>
+        <w:spacing w:line="360" w:lineRule="auto"/>
+        <w:jc w:val="both"/>
+      </w:pPr>
+      <w:r>
+        <w:t>Puede acceder a todos los tramos y núcleos agrarios.</w:t>
+      </w:r>
+    </w:p>
+    <w:p>
+      <w:pPr>
+        <w:pStyle w:val="Ttulo3"/>
+      </w:pPr>
+      <w:bookmarkStart w:id="8" w:name="_ri62i5zu37t" w:colFirst="0" w:colLast="0"/>
+      <w:bookmarkEnd w:id="8"/>
+      <w:r>
+        <w:lastRenderedPageBreak/>
+        <w:t>4.2 Operador</w:t>
+      </w:r>
+    </w:p>
+    <w:p>
+      <w:pPr>
+        <w:numPr>
+          <w:ilvl w:val="0"/>
+          <w:numId w:val="2"/>
+        </w:numPr>
+        <w:spacing w:line="360" w:lineRule="auto"/>
+        <w:jc w:val="both"/>
+      </w:pPr>
+      <w:r>
+        <w:t>Registra información de campo.</w:t>
+      </w:r>
+    </w:p>
+    <w:p>
+      <w:pPr>
+        <w:numPr>
+          <w:ilvl w:val="0"/>
+          <w:numId w:val="2"/>
+        </w:numPr>
+        <w:spacing w:line="360" w:lineRule="auto"/>
+        <w:jc w:val="both"/>
+      </w:pPr>
+      <w:r>
+        <w:t>Actualiza el estatus de núcleos agrarios.</w:t>
+      </w:r>
+    </w:p>
+    <w:p>
+      <w:pPr>
+        <w:numPr>
+          <w:ilvl w:val="0"/>
+          <w:numId w:val="2"/>
+        </w:numPr>
+        <w:spacing w:line="360" w:lineRule="auto"/>
+        <w:jc w:val="both"/>
+      </w:pPr>
+      <w:r>
+        <w:t>Solo accede a los tramos/núcleos que tiene asignados explícitamente.</w:t>
+      </w:r>
+    </w:p>
+    <w:p>
+      <w:pPr>
+        <w:pStyle w:val="Ttulo3"/>
+      </w:pPr>
+      <w:bookmarkStart w:id="9" w:name="_2ce6dtwonpi" w:colFirst="0" w:colLast="0"/>
+      <w:bookmarkEnd w:id="9"/>
+      <w:r>
+        <w:t>4.3 Analista / Lector</w:t>
+      </w:r>
+    </w:p>
+    <w:p>
+      <w:pPr>
+        <w:numPr>
+          <w:ilvl w:val="0"/>
+          <w:numId w:val="2"/>
+        </w:numPr>
+        <w:spacing w:line="360" w:lineRule="auto"/>
+        <w:jc w:val="both"/>
+      </w:pPr>
+      <w:r>
+        <w:t>Solo consulta información.</w:t>
+      </w:r>
+    </w:p>
+    <w:p>
+      <w:pPr>
+        <w:numPr>
+          <w:ilvl w:val="0"/>
+          <w:numId w:val="2"/>
+        </w:numPr>
+        <w:spacing w:line="360" w:lineRule="auto"/>
+        <w:jc w:val="both"/>
+      </w:pPr>
+      <w:r>
+        <w:t>No tiene permisos para registrar ni modificar datos.</w:t>
+      </w:r>
+    </w:p>
+    <w:p>
+      <w:pPr>
+        <w:numPr>
+          <w:ilvl w:val="0"/>
+          <w:numId w:val="2"/>
+        </w:numPr>
+        <w:spacing w:line="360" w:lineRule="auto"/>
+        <w:jc w:val="both"/>
+      </w:pPr>
+      <w:r>
+        <w:t>Su función principal es la generación de reportes y visualización de avances.</w:t>
+      </w:r>
+    </w:p>
+    <w:p>
+      <w:pPr>
         <w:widowControl w:val="0"/>
         <w:pBdr>
           <w:top w:val="nil"/>
@@ -818,21 +1114,25 @@
         </w:pBdr>
       </w:pPr>
     </w:p>
-    <w:p>
-      <w:r>
-        <w:pict w14:anchorId="43EB8FAB">
-          <v:rect id="_x0000_i1026" style="width:0;height:1.5pt" o:hralign="center" o:hrstd="t" o:hr="t" fillcolor="#a0a0a0" stroked="f"/>
-        </w:pict>
-      </w:r>
-    </w:p>
+    <w:p/>
     <w:p>
       <w:pPr>
         <w:pStyle w:val="Ttulo2"/>
       </w:pPr>
-      <w:bookmarkStart w:id="5" w:name="_f8aqb5l8ahs5" w:colFirst="0" w:colLast="0"/>
-      <w:bookmarkEnd w:id="5"/>
-      <w:r>
-        <w:t>3. Glosario de Términos</w:t>
+      <w:bookmarkStart w:id="10" w:name="_92kyr9ia3lei" w:colFirst="0" w:colLast="0"/>
+      <w:bookmarkEnd w:id="10"/>
+      <w:r>
+        <w:t>5. Reglas de Negocio (RN)</w:t>
+      </w:r>
+    </w:p>
+    <w:p>
+      <w:pPr>
+        <w:pStyle w:val="Ttulo3"/>
+      </w:pPr>
+      <w:bookmarkStart w:id="11" w:name="_ywuc585ugfix" w:colFirst="0" w:colLast="0"/>
+      <w:bookmarkEnd w:id="11"/>
+      <w:r>
+        <w:t>5.1 Control de Acceso</w:t>
       </w:r>
     </w:p>
     <w:p>
@@ -849,10 +1149,10 @@
           <w:b/>
           <w:bCs/>
         </w:rPr>
-        <w:t>PA:</w:t>
-      </w:r>
-      <w:r>
-        <w:t xml:space="preserve"> Procuraduría Agraria.</w:t>
+        <w:t>RN-01:</w:t>
+      </w:r>
+      <w:r>
+        <w:t xml:space="preserve"> Todo usuario debe autenticarse mediante credenciales válidas para acceder al sistema.</w:t>
       </w:r>
     </w:p>
     <w:p>
@@ -869,10 +1169,10 @@
           <w:b/>
           <w:bCs/>
         </w:rPr>
-        <w:t>Núcleo Agrario / Ejido:</w:t>
-      </w:r>
-      <w:r>
-        <w:t xml:space="preserve"> Entidad territorial (representada como un polígono) que se ve afectada por el paso de la línea del tren.</w:t>
+        <w:t>RN-02:</w:t>
+      </w:r>
+      <w:r>
+        <w:t xml:space="preserve"> El acceso a las funcionalidades y datos depende estrictamente del rol asignado al usuario.</w:t>
       </w:r>
     </w:p>
     <w:p>
@@ -889,10 +1189,10 @@
           <w:b/>
           <w:bCs/>
         </w:rPr>
-        <w:t>Tramo:</w:t>
-      </w:r>
-      <w:r>
-        <w:t xml:space="preserve"> Segmentos específicos de la ruta del tren que atraviesan los núcleos agrarios; su unidad de interés para la PA es en kilómetros o metros lineales.</w:t>
+        <w:t>RN-03:</w:t>
+      </w:r>
+      <w:r>
+        <w:t xml:space="preserve"> Un Analista/Lector tiene restringida la creación o modificación de información.</w:t>
       </w:r>
     </w:p>
     <w:p>
@@ -909,10 +1209,10 @@
           <w:b/>
           <w:bCs/>
         </w:rPr>
-        <w:t>COP:</w:t>
-      </w:r>
-      <w:r>
-        <w:t xml:space="preserve"> Convenio de Ocupación Previa (utilizado en el estatus "Autorización firma de COP").</w:t>
+        <w:t>RN-04:</w:t>
+      </w:r>
+      <w:r>
+        <w:t xml:space="preserve"> Un Operador solo puede capturar o modificar datos de los núcleos que le han sido asignados.</w:t>
       </w:r>
     </w:p>
     <w:p>
@@ -929,10 +1229,20 @@
           <w:b/>
           <w:bCs/>
         </w:rPr>
-        <w:t>Frente:</w:t>
-      </w:r>
-      <w:r>
-        <w:t xml:space="preserve"> Entorno de trabajo de campo donde operan técnicos y organizadores.</w:t>
+        <w:t>RN-05:</w:t>
+      </w:r>
+      <w:r>
+        <w:t xml:space="preserve"> El Administrador posee facultades para acceder y modificar cualquier registro dentro de la plataforma.</w:t>
+      </w:r>
+    </w:p>
+    <w:p>
+      <w:pPr>
+        <w:pStyle w:val="Ttulo3"/>
+      </w:pPr>
+      <w:bookmarkStart w:id="12" w:name="_d8el1ii4hs92" w:colFirst="0" w:colLast="0"/>
+      <w:bookmarkEnd w:id="12"/>
+      <w:r>
+        <w:t xml:space="preserve">5.2 Gestión de Núcleos Agrarios </w:t>
       </w:r>
     </w:p>
     <w:p>
@@ -949,10 +1259,629 @@
           <w:b/>
           <w:bCs/>
         </w:rPr>
-        <w:t>RAN:</w:t>
-      </w:r>
-      <w:r>
-        <w:t xml:space="preserve"> Registro Agrario Nacional, donde se inscriben los convenios.</w:t>
+        <w:t>RN-06:</w:t>
+      </w:r>
+      <w:r>
+        <w:t xml:space="preserve"> Cada núcleo agrario se representa cartográficamente mediante un único polígono cerrado.</w:t>
+      </w:r>
+    </w:p>
+    <w:p>
+      <w:pPr>
+        <w:numPr>
+          <w:ilvl w:val="0"/>
+          <w:numId w:val="2"/>
+        </w:numPr>
+        <w:spacing w:line="360" w:lineRule="auto"/>
+        <w:jc w:val="both"/>
+      </w:pPr>
+      <w:r>
+        <w:rPr>
+          <w:b/>
+          <w:bCs/>
+        </w:rPr>
+        <w:t>RN-07:</w:t>
+      </w:r>
+      <w:r>
+        <w:t xml:space="preserve"> Un núcleo agrario puede ser atravesado por el trazo del tren en múltiples puntos o segmentos.</w:t>
+      </w:r>
+    </w:p>
+    <w:p>
+      <w:pPr>
+        <w:numPr>
+          <w:ilvl w:val="0"/>
+          <w:numId w:val="5"/>
+        </w:numPr>
+        <w:spacing w:after="160" w:line="278" w:lineRule="auto"/>
+      </w:pPr>
+      <w:r>
+        <w:rPr>
+          <w:b/>
+          <w:bCs/>
+        </w:rPr>
+        <w:t>RN-08:</w:t>
+      </w:r>
+      <w:r>
+        <w:t xml:space="preserve"> El estado del núcleo agrario es único; </w:t>
+      </w:r>
+      <w:r>
+        <w:t>(no puede haber múltiples estados dentro del mismo núcleo)</w:t>
+      </w:r>
+      <w:r>
+        <w:t>.</w:t>
+      </w:r>
+    </w:p>
+    <w:p>
+      <w:pPr>
+        <w:pStyle w:val="Ttulo3"/>
+      </w:pPr>
+      <w:r>
+        <w:lastRenderedPageBreak/>
+        <w:t>5.3 Estado del Tramo</w:t>
+      </w:r>
+    </w:p>
+    <w:p>
+      <w:pPr>
+        <w:numPr>
+          <w:ilvl w:val="0"/>
+          <w:numId w:val="2"/>
+        </w:numPr>
+        <w:spacing w:line="360" w:lineRule="auto"/>
+        <w:jc w:val="both"/>
+      </w:pPr>
+      <w:r>
+        <w:rPr>
+          <w:b/>
+          <w:bCs/>
+        </w:rPr>
+        <w:t>RN-09:</w:t>
+      </w:r>
+      <w:r>
+        <w:t xml:space="preserve"> El estado visual del tramo (línea del tren) dentro de un núcleo depende directamente del estado legal y administrativo de dicho núcleo.</w:t>
+      </w:r>
+    </w:p>
+    <w:p>
+      <w:pPr>
+        <w:numPr>
+          <w:ilvl w:val="0"/>
+          <w:numId w:val="2"/>
+        </w:numPr>
+        <w:spacing w:line="360" w:lineRule="auto"/>
+        <w:jc w:val="both"/>
+      </w:pPr>
+      <w:r>
+        <w:rPr>
+          <w:b/>
+          <w:bCs/>
+        </w:rPr>
+        <w:t>RN-10:</w:t>
+      </w:r>
+      <w:r>
+        <w:t xml:space="preserve"> Los estados posibles para un núcleo/tramo son:</w:t>
+      </w:r>
+    </w:p>
+    <w:p>
+      <w:pPr>
+        <w:numPr>
+          <w:ilvl w:val="1"/>
+          <w:numId w:val="2"/>
+        </w:numPr>
+        <w:spacing w:line="360" w:lineRule="auto"/>
+        <w:jc w:val="both"/>
+      </w:pPr>
+      <w:r>
+        <w:rPr>
+          <w:b/>
+          <w:bCs/>
+        </w:rPr>
+        <w:t>Liberado (verde):</w:t>
+      </w:r>
+      <w:r>
+        <w:t xml:space="preserve"> Proceso concluido y listo para construcción.</w:t>
+      </w:r>
+    </w:p>
+    <w:p>
+      <w:pPr>
+        <w:numPr>
+          <w:ilvl w:val="1"/>
+          <w:numId w:val="2"/>
+        </w:numPr>
+        <w:spacing w:line="360" w:lineRule="auto"/>
+        <w:jc w:val="both"/>
+      </w:pPr>
+      <w:r>
+        <w:rPr>
+          <w:b/>
+          <w:bCs/>
+        </w:rPr>
+        <w:t>Pendiente (gris):</w:t>
+      </w:r>
+      <w:r>
+        <w:t xml:space="preserve"> Proceso no iniciado o sin contacto con ejidatarios.</w:t>
+      </w:r>
+    </w:p>
+    <w:p>
+      <w:pPr>
+        <w:numPr>
+          <w:ilvl w:val="1"/>
+          <w:numId w:val="2"/>
+        </w:numPr>
+        <w:spacing w:line="360" w:lineRule="auto"/>
+        <w:jc w:val="both"/>
+      </w:pPr>
+      <w:r>
+        <w:rPr>
+          <w:b/>
+          <w:bCs/>
+        </w:rPr>
+        <w:t>Problema (rojo):</w:t>
+      </w:r>
+      <w:r>
+        <w:t xml:space="preserve"> Conflictos detectados con ejidatarios o con el terreno.</w:t>
+      </w:r>
+    </w:p>
+    <w:p>
+      <w:pPr>
+        <w:pStyle w:val="Ttulo3"/>
+      </w:pPr>
+      <w:bookmarkStart w:id="13" w:name="_v32grwonix08" w:colFirst="0" w:colLast="0"/>
+      <w:bookmarkEnd w:id="13"/>
+      <w:r>
+        <w:t>5.</w:t>
+      </w:r>
+      <w:r>
+        <w:t>4</w:t>
+      </w:r>
+      <w:r>
+        <w:t xml:space="preserve"> Asambleas y </w:t>
+      </w:r>
+      <w:r>
+        <w:t>Convenios</w:t>
+      </w:r>
+    </w:p>
+    <w:p>
+      <w:pPr>
+        <w:numPr>
+          <w:ilvl w:val="0"/>
+          <w:numId w:val="2"/>
+        </w:numPr>
+        <w:spacing w:line="360" w:lineRule="auto"/>
+        <w:jc w:val="both"/>
+      </w:pPr>
+      <w:r>
+        <w:rPr>
+          <w:b/>
+          <w:bCs/>
+        </w:rPr>
+        <w:t>RN-11:</w:t>
+      </w:r>
+      <w:r>
+        <w:t xml:space="preserve"> Para cada núcleo agrario es obligatorio registrar</w:t>
+      </w:r>
+      <w:r>
+        <w:t>:</w:t>
+      </w:r>
+    </w:p>
+    <w:p>
+      <w:pPr>
+        <w:numPr>
+          <w:ilvl w:val="1"/>
+          <w:numId w:val="2"/>
+        </w:numPr>
+        <w:spacing w:after="160" w:line="360" w:lineRule="auto"/>
+        <w:jc w:val="both"/>
+      </w:pPr>
+      <w:r>
+        <w:t xml:space="preserve">3 </w:t>
+      </w:r>
+      <w:r>
+        <w:t xml:space="preserve">Asambleas programadas </w:t>
+      </w:r>
+    </w:p>
+    <w:p>
+      <w:pPr>
+        <w:numPr>
+          <w:ilvl w:val="1"/>
+          <w:numId w:val="2"/>
+        </w:numPr>
+        <w:spacing w:after="160" w:line="360" w:lineRule="auto"/>
+        <w:jc w:val="both"/>
+      </w:pPr>
+      <w:r>
+        <w:t xml:space="preserve">Asambleas convocadas </w:t>
+      </w:r>
+    </w:p>
+    <w:p>
+      <w:pPr>
+        <w:numPr>
+          <w:ilvl w:val="1"/>
+          <w:numId w:val="2"/>
+        </w:numPr>
+        <w:spacing w:after="160" w:line="360" w:lineRule="auto"/>
+        <w:jc w:val="both"/>
+      </w:pPr>
+      <w:r>
+        <w:t xml:space="preserve">Asambleas realizadas con autorización </w:t>
+      </w:r>
+    </w:p>
+    <w:p>
+      <w:pPr>
+        <w:numPr>
+          <w:ilvl w:val="1"/>
+          <w:numId w:val="2"/>
+        </w:numPr>
+        <w:spacing w:after="160" w:line="360" w:lineRule="auto"/>
+        <w:jc w:val="both"/>
+      </w:pPr>
+      <w:r>
+        <w:t>Convenios firmados</w:t>
+      </w:r>
+    </w:p>
+    <w:p>
+      <w:pPr>
+        <w:numPr>
+          <w:ilvl w:val="0"/>
+          <w:numId w:val="2"/>
+        </w:numPr>
+        <w:spacing w:line="360" w:lineRule="auto"/>
+        <w:jc w:val="both"/>
+      </w:pPr>
+      <w:r>
+        <w:rPr>
+          <w:b/>
+          <w:bCs/>
+        </w:rPr>
+        <w:t>RN-12:</w:t>
+      </w:r>
+      <w:r>
+        <w:t xml:space="preserve"> </w:t>
+      </w:r>
+      <w:r>
+        <w:t>El estado del núcleo agrario depende del avance de estos indicadores (definición pendiente)</w:t>
+      </w:r>
+      <w:r>
+        <w:t>.</w:t>
+      </w:r>
+    </w:p>
+    <w:p>
+      <w:pPr>
+        <w:pStyle w:val="Ttulo3"/>
+      </w:pPr>
+      <w:bookmarkStart w:id="14" w:name="_55ozgjcgfo5" w:colFirst="0" w:colLast="0"/>
+      <w:bookmarkEnd w:id="14"/>
+      <w:r>
+        <w:t>5.</w:t>
+      </w:r>
+      <w:r>
+        <w:t>5</w:t>
+      </w:r>
+      <w:r>
+        <w:t xml:space="preserve"> </w:t>
+      </w:r>
+      <w:r>
+        <w:t>Datos y consistencia</w:t>
+      </w:r>
+    </w:p>
+    <w:p>
+      <w:pPr>
+        <w:numPr>
+          <w:ilvl w:val="0"/>
+          <w:numId w:val="2"/>
+        </w:numPr>
+        <w:spacing w:line="360" w:lineRule="auto"/>
+        <w:jc w:val="both"/>
+      </w:pPr>
+      <w:r>
+        <w:rPr>
+          <w:b/>
+          <w:bCs/>
+        </w:rPr>
+        <w:t>RN-1</w:t>
+      </w:r>
+      <w:r>
+        <w:rPr>
+          <w:b/>
+          <w:bCs/>
+        </w:rPr>
+        <w:t>3</w:t>
+      </w:r>
+      <w:r>
+        <w:rPr>
+          <w:b/>
+          <w:bCs/>
+        </w:rPr>
+        <w:t>:</w:t>
+      </w:r>
+      <w:r>
+        <w:t xml:space="preserve"> </w:t>
+      </w:r>
+      <w:r>
+        <w:t>Toda la información capturada debe almacenarse en la base de datos del sistema</w:t>
+      </w:r>
+      <w:r>
+        <w:t>.</w:t>
+      </w:r>
+    </w:p>
+    <w:p>
+      <w:pPr>
+        <w:numPr>
+          <w:ilvl w:val="0"/>
+          <w:numId w:val="2"/>
+        </w:numPr>
+        <w:spacing w:line="360" w:lineRule="auto"/>
+        <w:jc w:val="both"/>
+      </w:pPr>
+      <w:r>
+        <w:rPr>
+          <w:b/>
+          <w:bCs/>
+        </w:rPr>
+        <w:t>RN-1</w:t>
+      </w:r>
+      <w:r>
+        <w:rPr>
+          <w:b/>
+          <w:bCs/>
+        </w:rPr>
+        <w:t>4</w:t>
+      </w:r>
+      <w:r>
+        <w:rPr>
+          <w:b/>
+          <w:bCs/>
+        </w:rPr>
+        <w:t>:</w:t>
+      </w:r>
+      <w:r>
+        <w:t xml:space="preserve"> </w:t>
+      </w:r>
+      <w:r>
+        <w:t>El sistema debe permitir generar reportes con la información actual</w:t>
+      </w:r>
+      <w:r>
+        <w:t>.</w:t>
+      </w:r>
+    </w:p>
+    <w:p>
+      <w:pPr>
+        <w:numPr>
+          <w:ilvl w:val="0"/>
+          <w:numId w:val="2"/>
+        </w:numPr>
+        <w:spacing w:line="360" w:lineRule="auto"/>
+        <w:jc w:val="both"/>
+      </w:pPr>
+      <w:r>
+        <w:rPr>
+          <w:b/>
+          <w:bCs/>
+        </w:rPr>
+        <w:t>RN-1</w:t>
+      </w:r>
+      <w:r>
+        <w:rPr>
+          <w:b/>
+          <w:bCs/>
+        </w:rPr>
+        <w:t>5</w:t>
+      </w:r>
+      <w:r>
+        <w:rPr>
+          <w:b/>
+          <w:bCs/>
+        </w:rPr>
+        <w:t>:</w:t>
+      </w:r>
+      <w:r>
+        <w:t xml:space="preserve"> </w:t>
+      </w:r>
+      <w:r>
+        <w:t>El sistema debe registrar cambios realizados por los usuarios (auditoría básica – pendiente detalle)</w:t>
+      </w:r>
+      <w:r>
+        <w:t>.</w:t>
+      </w:r>
+    </w:p>
+    <w:p>
+      <w:pPr>
+        <w:spacing w:line="360" w:lineRule="auto"/>
+        <w:jc w:val="both"/>
+      </w:pPr>
+    </w:p>
+    <w:p>
+      <w:pPr>
+        <w:spacing w:line="360" w:lineRule="auto"/>
+        <w:jc w:val="both"/>
+      </w:pPr>
+    </w:p>
+    <w:p>
+      <w:pPr>
+        <w:spacing w:line="360" w:lineRule="auto"/>
+        <w:jc w:val="both"/>
+      </w:pPr>
+    </w:p>
+    <w:p>
+      <w:pPr>
+        <w:spacing w:line="360" w:lineRule="auto"/>
+        <w:jc w:val="both"/>
+      </w:pPr>
+    </w:p>
+    <w:p>
+      <w:pPr>
+        <w:spacing w:line="360" w:lineRule="auto"/>
+        <w:jc w:val="both"/>
+      </w:pPr>
+    </w:p>
+    <w:p>
+      <w:pPr>
+        <w:spacing w:line="360" w:lineRule="auto"/>
+        <w:jc w:val="both"/>
+      </w:pPr>
+    </w:p>
+    <w:p>
+      <w:pPr>
+        <w:spacing w:line="360" w:lineRule="auto"/>
+        <w:jc w:val="both"/>
+      </w:pPr>
+    </w:p>
+    <w:p>
+      <w:pPr>
+        <w:spacing w:line="360" w:lineRule="auto"/>
+        <w:jc w:val="both"/>
+      </w:pPr>
+    </w:p>
+    <w:p>
+      <w:pPr>
+        <w:pStyle w:val="Ttulo3"/>
+      </w:pPr>
+      <w:r>
+        <w:lastRenderedPageBreak/>
+        <w:t>5.6</w:t>
+      </w:r>
+      <w:r>
+        <w:t xml:space="preserve"> Visualización</w:t>
+      </w:r>
+    </w:p>
+    <w:p>
+      <w:pPr>
+        <w:numPr>
+          <w:ilvl w:val="0"/>
+          <w:numId w:val="6"/>
+        </w:numPr>
+        <w:spacing w:after="160" w:line="278" w:lineRule="auto"/>
+      </w:pPr>
+      <w:r>
+        <w:rPr>
+          <w:b/>
+          <w:bCs/>
+        </w:rPr>
+        <w:t>RN-16</w:t>
+      </w:r>
+      <w:r>
+        <w:t xml:space="preserve">: El mapa debe mostrar: </w:t>
+      </w:r>
+    </w:p>
+    <w:p>
+      <w:pPr>
+        <w:numPr>
+          <w:ilvl w:val="1"/>
+          <w:numId w:val="6"/>
+        </w:numPr>
+        <w:spacing w:after="160" w:line="278" w:lineRule="auto"/>
+      </w:pPr>
+      <w:r>
+        <w:t xml:space="preserve">Núcleos agrarios (polígonos) </w:t>
+      </w:r>
+    </w:p>
+    <w:p>
+      <w:pPr>
+        <w:numPr>
+          <w:ilvl w:val="1"/>
+          <w:numId w:val="6"/>
+        </w:numPr>
+        <w:spacing w:after="160" w:line="278" w:lineRule="auto"/>
+      </w:pPr>
+      <w:r>
+        <w:t xml:space="preserve">Tramo del tren (línea) </w:t>
+      </w:r>
+    </w:p>
+    <w:p>
+      <w:pPr>
+        <w:numPr>
+          <w:ilvl w:val="0"/>
+          <w:numId w:val="6"/>
+        </w:numPr>
+        <w:spacing w:after="160" w:line="278" w:lineRule="auto"/>
+      </w:pPr>
+      <w:r>
+        <w:rPr>
+          <w:b/>
+          <w:bCs/>
+        </w:rPr>
+        <w:t>RN-17</w:t>
+      </w:r>
+      <w:r>
+        <w:t xml:space="preserve">: El tramo debe colorearse según el estado del núcleo agrario correspondiente </w:t>
+      </w:r>
+    </w:p>
+    <w:p>
+      <w:pPr>
+        <w:numPr>
+          <w:ilvl w:val="0"/>
+          <w:numId w:val="6"/>
+        </w:numPr>
+        <w:spacing w:after="160" w:line="278" w:lineRule="auto"/>
+      </w:pPr>
+      <w:r>
+        <w:rPr>
+          <w:b/>
+          <w:bCs/>
+        </w:rPr>
+        <w:t>RN-18</w:t>
+      </w:r>
+      <w:r>
+        <w:t xml:space="preserve">: Un mismo núcleo puede aparecer múltiples veces en el trazo </w:t>
+      </w:r>
+    </w:p>
+    <w:p>
+      <w:pPr>
+        <w:numPr>
+          <w:ilvl w:val="0"/>
+          <w:numId w:val="6"/>
+        </w:numPr>
+        <w:spacing w:after="160" w:line="278" w:lineRule="auto"/>
+      </w:pPr>
+      <w:r>
+        <w:rPr>
+          <w:b/>
+          <w:bCs/>
+        </w:rPr>
+        <w:t>RN</w:t>
+      </w:r>
+      <w:r>
+        <w:t>-</w:t>
+      </w:r>
+      <w:r>
+        <w:rPr>
+          <w:b/>
+          <w:bCs/>
+        </w:rPr>
+        <w:t>19</w:t>
+      </w:r>
+      <w:r>
+        <w:rPr>
+          <w:b/>
+          <w:bCs/>
+        </w:rPr>
+        <w:t>:</w:t>
+      </w:r>
+      <w:r>
+        <w:rPr>
+          <w:b/>
+          <w:bCs/>
+        </w:rPr>
+        <w:t xml:space="preserve"> </w:t>
+      </w:r>
+      <w:r>
+        <w:t>Un núcleo agrario debe tener un estado definido en todo momento</w:t>
+      </w:r>
+    </w:p>
+    <w:p>
+      <w:pPr>
+        <w:numPr>
+          <w:ilvl w:val="0"/>
+          <w:numId w:val="6"/>
+        </w:numPr>
+        <w:spacing w:after="160" w:line="278" w:lineRule="auto"/>
+      </w:pPr>
+      <w:r>
+        <w:rPr>
+          <w:b/>
+          <w:bCs/>
+        </w:rPr>
+        <w:t xml:space="preserve">RN-20: </w:t>
+      </w:r>
+      <w:r>
+        <w:t>Los valores numéricos de asambleas y convenios no pueden ser negativos</w:t>
       </w:r>
     </w:p>
     <w:p>
@@ -967,88 +1896,650 @@
         </w:pBdr>
       </w:pPr>
     </w:p>
-    <w:p>
-      <w:r>
-        <w:pict w14:anchorId="3EF370C8">
-          <v:rect id="_x0000_i1027" style="width:0;height:1.5pt" o:hralign="center" o:hrstd="t" o:hr="t" fillcolor="#a0a0a0" stroked="f"/>
-        </w:pict>
-      </w:r>
-    </w:p>
+    <w:p/>
     <w:p>
       <w:pPr>
         <w:pStyle w:val="Ttulo2"/>
       </w:pPr>
-      <w:bookmarkStart w:id="6" w:name="_3tl3wpe2pvbq" w:colFirst="0" w:colLast="0"/>
-      <w:bookmarkEnd w:id="6"/>
-      <w:r>
-        <w:t>4. Actores del Sistema</w:t>
+      <w:bookmarkStart w:id="15" w:name="_z3dhqx4787r5" w:colFirst="0" w:colLast="0"/>
+      <w:bookmarkEnd w:id="15"/>
+      <w:r>
+        <w:t>6. Requerimientos Funcionales (RF)</w:t>
       </w:r>
     </w:p>
     <w:p>
       <w:pPr>
         <w:pStyle w:val="Ttulo3"/>
       </w:pPr>
-      <w:bookmarkStart w:id="7" w:name="_m8m6uf1is6cy" w:colFirst="0" w:colLast="0"/>
-      <w:bookmarkEnd w:id="7"/>
-      <w:r>
-        <w:t>4.1 Administrador (</w:t>
-      </w:r>
-      <w:proofErr w:type="spellStart"/>
-      <w:r>
-        <w:t>Admin</w:t>
-      </w:r>
-      <w:proofErr w:type="spellEnd"/>
-      <w:r>
-        <w:t>)</w:t>
-      </w:r>
-    </w:p>
-    <w:p>
-      <w:pPr>
-        <w:numPr>
-          <w:ilvl w:val="0"/>
-          <w:numId w:val="2"/>
+      <w:bookmarkStart w:id="16" w:name="_mhzw5evw1aox" w:colFirst="0" w:colLast="0"/>
+      <w:bookmarkEnd w:id="16"/>
+      <w:r>
+        <w:t xml:space="preserve">6.1 Autenticación </w:t>
+      </w:r>
+    </w:p>
+    <w:p>
+      <w:pPr>
+        <w:numPr>
+          <w:ilvl w:val="0"/>
+          <w:numId w:val="7"/>
+        </w:numPr>
+        <w:spacing w:after="160" w:line="278" w:lineRule="auto"/>
+      </w:pPr>
+      <w:bookmarkStart w:id="17" w:name="_wctwlqsf30e" w:colFirst="0" w:colLast="0"/>
+      <w:bookmarkEnd w:id="17"/>
+      <w:r>
+        <w:rPr>
+          <w:b/>
+          <w:bCs/>
+        </w:rPr>
+        <w:t>RF-01</w:t>
+      </w:r>
+      <w:r>
+        <w:t xml:space="preserve">: El sistema debe permitir a los usuarios iniciar sesión con correo y contraseña </w:t>
+      </w:r>
+    </w:p>
+    <w:p>
+      <w:pPr>
+        <w:numPr>
+          <w:ilvl w:val="0"/>
+          <w:numId w:val="7"/>
+        </w:numPr>
+        <w:spacing w:after="160" w:line="278" w:lineRule="auto"/>
+      </w:pPr>
+      <w:r>
+        <w:rPr>
+          <w:b/>
+          <w:bCs/>
+        </w:rPr>
+        <w:t>RF-02</w:t>
+      </w:r>
+      <w:r>
+        <w:t xml:space="preserve">: El sistema debe permitir recuperar contraseña </w:t>
+      </w:r>
+    </w:p>
+    <w:p>
+      <w:pPr>
+        <w:numPr>
+          <w:ilvl w:val="0"/>
+          <w:numId w:val="7"/>
+        </w:numPr>
+        <w:spacing w:after="160" w:line="278" w:lineRule="auto"/>
+      </w:pPr>
+      <w:r>
+        <w:rPr>
+          <w:b/>
+          <w:bCs/>
+        </w:rPr>
+        <w:t>RF-03</w:t>
+      </w:r>
+      <w:r>
+        <w:t xml:space="preserve">: El sistema debe mantener sesión activa del usuario </w:t>
+      </w:r>
+    </w:p>
+    <w:p>
+      <w:pPr>
+        <w:pStyle w:val="Ttulo3"/>
+      </w:pPr>
+      <w:r>
+        <w:t xml:space="preserve">6.2 </w:t>
+      </w:r>
+      <w:bookmarkStart w:id="18" w:name="_ozx43kq1htt4" w:colFirst="0" w:colLast="0"/>
+      <w:bookmarkEnd w:id="18"/>
+      <w:r>
+        <w:t>Gestión de usuarios</w:t>
+      </w:r>
+    </w:p>
+    <w:p>
+      <w:pPr>
+        <w:pStyle w:val="Prrafodelista"/>
+        <w:numPr>
+          <w:ilvl w:val="0"/>
+          <w:numId w:val="8"/>
         </w:numPr>
         <w:spacing w:line="360" w:lineRule="auto"/>
         <w:jc w:val="both"/>
       </w:pPr>
       <w:r>
-        <w:t>Acceso total al sistema.</w:t>
-      </w:r>
-    </w:p>
-    <w:p>
-      <w:pPr>
-        <w:numPr>
-          <w:ilvl w:val="0"/>
-          <w:numId w:val="2"/>
+        <w:rPr>
+          <w:b/>
+          <w:bCs/>
+        </w:rPr>
+        <w:t>RF-04</w:t>
+      </w:r>
+      <w:r>
+        <w:t xml:space="preserve">: El sistema debe permitir al Administrador crear usuarios </w:t>
+      </w:r>
+    </w:p>
+    <w:p>
+      <w:pPr>
+        <w:pStyle w:val="Prrafodelista"/>
+        <w:numPr>
+          <w:ilvl w:val="0"/>
+          <w:numId w:val="8"/>
         </w:numPr>
         <w:spacing w:line="360" w:lineRule="auto"/>
         <w:jc w:val="both"/>
       </w:pPr>
       <w:r>
-        <w:t>Puede visualizar, registrar, modificar y eliminar información.</w:t>
-      </w:r>
-    </w:p>
-    <w:p>
-      <w:pPr>
-        <w:numPr>
-          <w:ilvl w:val="0"/>
-          <w:numId w:val="2"/>
+        <w:rPr>
+          <w:b/>
+          <w:bCs/>
+        </w:rPr>
+        <w:t>RF-05</w:t>
+      </w:r>
+      <w:r>
+        <w:t xml:space="preserve">: El sistema debe permitir asignar roles a usuarios </w:t>
+      </w:r>
+    </w:p>
+    <w:p>
+      <w:pPr>
+        <w:pStyle w:val="Prrafodelista"/>
+        <w:numPr>
+          <w:ilvl w:val="0"/>
+          <w:numId w:val="8"/>
         </w:numPr>
         <w:spacing w:line="360" w:lineRule="auto"/>
         <w:jc w:val="both"/>
       </w:pPr>
       <w:r>
-        <w:t>Puede acceder a todos los tramos y núcleos agrarios.</w:t>
+        <w:rPr>
+          <w:b/>
+          <w:bCs/>
+        </w:rPr>
+        <w:t>RF-06</w:t>
+      </w:r>
+      <w:r>
+        <w:t xml:space="preserve">: El sistema debe permitir editar usuarios </w:t>
+      </w:r>
+    </w:p>
+    <w:p>
+      <w:pPr>
+        <w:pStyle w:val="Prrafodelista"/>
+        <w:numPr>
+          <w:ilvl w:val="0"/>
+          <w:numId w:val="8"/>
+        </w:numPr>
+        <w:spacing w:line="360" w:lineRule="auto"/>
+        <w:ind w:left="1440" w:hanging="1080"/>
+        <w:jc w:val="both"/>
+      </w:pPr>
+      <w:r>
+        <w:rPr>
+          <w:b/>
+          <w:bCs/>
+        </w:rPr>
+        <w:t>RF-07</w:t>
+      </w:r>
+      <w:r>
+        <w:t xml:space="preserve">: El sistema debe permitir desactivar usuarios </w:t>
       </w:r>
     </w:p>
     <w:p>
       <w:pPr>
         <w:pStyle w:val="Ttulo3"/>
       </w:pPr>
-      <w:bookmarkStart w:id="8" w:name="_ri62i5zu37t" w:colFirst="0" w:colLast="0"/>
-      <w:bookmarkEnd w:id="8"/>
-      <w:r>
-        <w:t>4.2 Operador</w:t>
+      <w:r>
+        <w:t xml:space="preserve">6.3 </w:t>
+      </w:r>
+      <w:bookmarkStart w:id="19" w:name="_4kdk4klqkjw1" w:colFirst="0" w:colLast="0"/>
+      <w:bookmarkEnd w:id="19"/>
+      <w:r>
+        <w:t>Gestión de núcleos agrarios</w:t>
+      </w:r>
+    </w:p>
+    <w:p>
+      <w:pPr>
+        <w:numPr>
+          <w:ilvl w:val="0"/>
+          <w:numId w:val="9"/>
+        </w:numPr>
+        <w:spacing w:after="160" w:line="278" w:lineRule="auto"/>
+      </w:pPr>
+      <w:r>
+        <w:rPr>
+          <w:b/>
+          <w:bCs/>
+        </w:rPr>
+        <w:t>RF-08</w:t>
+      </w:r>
+      <w:r>
+        <w:t xml:space="preserve">: El sistema debe permitir registrar núcleos agrarios </w:t>
+      </w:r>
+    </w:p>
+    <w:p>
+      <w:pPr>
+        <w:numPr>
+          <w:ilvl w:val="0"/>
+          <w:numId w:val="9"/>
+        </w:numPr>
+        <w:spacing w:after="160" w:line="278" w:lineRule="auto"/>
+      </w:pPr>
+      <w:r>
+        <w:rPr>
+          <w:b/>
+          <w:bCs/>
+        </w:rPr>
+        <w:t>RF-09</w:t>
+      </w:r>
+      <w:r>
+        <w:t xml:space="preserve">: El sistema debe permitir visualizar núcleos agrarios </w:t>
+      </w:r>
+    </w:p>
+    <w:p>
+      <w:pPr>
+        <w:numPr>
+          <w:ilvl w:val="0"/>
+          <w:numId w:val="9"/>
+        </w:numPr>
+        <w:spacing w:after="160" w:line="278" w:lineRule="auto"/>
+      </w:pPr>
+      <w:r>
+        <w:rPr>
+          <w:b/>
+          <w:bCs/>
+        </w:rPr>
+        <w:t>RF-10</w:t>
+      </w:r>
+      <w:r>
+        <w:t xml:space="preserve">: El sistema debe permitir actualizar información de núcleos (solo </w:t>
+      </w:r>
+      <w:proofErr w:type="spellStart"/>
+      <w:r>
+        <w:t>Admin</w:t>
+      </w:r>
+      <w:proofErr w:type="spellEnd"/>
+      <w:r>
+        <w:t xml:space="preserve"> y Operador autorizado) </w:t>
+      </w:r>
+    </w:p>
+    <w:p>
+      <w:pPr>
+        <w:numPr>
+          <w:ilvl w:val="0"/>
+          <w:numId w:val="9"/>
+        </w:numPr>
+        <w:spacing w:after="160" w:line="278" w:lineRule="auto"/>
+      </w:pPr>
+      <w:r>
+        <w:rPr>
+          <w:b/>
+          <w:bCs/>
+        </w:rPr>
+        <w:t>RF-11</w:t>
+      </w:r>
+      <w:r>
+        <w:t xml:space="preserve">: El sistema debe mostrar el estado actual del núcleo </w:t>
+      </w:r>
+    </w:p>
+    <w:p>
+      <w:pPr>
+        <w:pStyle w:val="Ttulo3"/>
+      </w:pPr>
+      <w:r>
+        <w:lastRenderedPageBreak/>
+        <w:t xml:space="preserve">6.4 </w:t>
+      </w:r>
+      <w:bookmarkStart w:id="20" w:name="_qvysnpmkj" w:colFirst="0" w:colLast="0"/>
+      <w:bookmarkEnd w:id="20"/>
+      <w:r>
+        <w:t>Captura de información (Operador)</w:t>
+      </w:r>
+    </w:p>
+    <w:p>
+      <w:pPr>
+        <w:numPr>
+          <w:ilvl w:val="0"/>
+          <w:numId w:val="10"/>
+        </w:numPr>
+        <w:spacing w:after="160" w:line="278" w:lineRule="auto"/>
+      </w:pPr>
+      <w:r>
+        <w:rPr>
+          <w:b/>
+          <w:bCs/>
+        </w:rPr>
+        <w:t>RF-12</w:t>
+      </w:r>
+      <w:r>
+        <w:t xml:space="preserve">: El sistema debe permitir registrar información de un núcleo agrario (formulario – campos pendientes) </w:t>
+      </w:r>
+    </w:p>
+    <w:p>
+      <w:pPr>
+        <w:numPr>
+          <w:ilvl w:val="0"/>
+          <w:numId w:val="10"/>
+        </w:numPr>
+        <w:spacing w:after="160" w:line="278" w:lineRule="auto"/>
+      </w:pPr>
+      <w:r>
+        <w:rPr>
+          <w:b/>
+          <w:bCs/>
+        </w:rPr>
+        <w:t>RF-13</w:t>
+      </w:r>
+      <w:r>
+        <w:t xml:space="preserve">: El sistema debe permitir actualizar información existente </w:t>
+      </w:r>
+    </w:p>
+    <w:p>
+      <w:pPr>
+        <w:numPr>
+          <w:ilvl w:val="0"/>
+          <w:numId w:val="10"/>
+        </w:numPr>
+        <w:spacing w:after="160" w:line="278" w:lineRule="auto"/>
+      </w:pPr>
+      <w:r>
+        <w:rPr>
+          <w:b/>
+          <w:bCs/>
+        </w:rPr>
+        <w:t>RF-14</w:t>
+      </w:r>
+      <w:r>
+        <w:t xml:space="preserve">: El sistema debe validar permisos antes de permitir la captura </w:t>
+      </w:r>
+    </w:p>
+    <w:p>
+      <w:pPr>
+        <w:numPr>
+          <w:ilvl w:val="0"/>
+          <w:numId w:val="10"/>
+        </w:numPr>
+        <w:spacing w:after="160" w:line="278" w:lineRule="auto"/>
+      </w:pPr>
+      <w:r>
+        <w:rPr>
+          <w:b/>
+          <w:bCs/>
+        </w:rPr>
+        <w:t>RF-15</w:t>
+      </w:r>
+      <w:r>
+        <w:t xml:space="preserve">: El sistema debe mostrar mensaje de restricción cuando el usuario no tenga permisos </w:t>
+      </w:r>
+    </w:p>
+    <w:p>
+      <w:pPr>
+        <w:pStyle w:val="Ttulo3"/>
+      </w:pPr>
+      <w:r>
+        <w:t xml:space="preserve">6.5 </w:t>
+      </w:r>
+      <w:r>
+        <w:t>Visualización del mapa</w:t>
+      </w:r>
+    </w:p>
+    <w:p>
+      <w:pPr>
+        <w:numPr>
+          <w:ilvl w:val="0"/>
+          <w:numId w:val="11"/>
+        </w:numPr>
+        <w:spacing w:after="160" w:line="278" w:lineRule="auto"/>
+      </w:pPr>
+      <w:r>
+        <w:rPr>
+          <w:b/>
+          <w:bCs/>
+        </w:rPr>
+        <w:t>RF-16</w:t>
+      </w:r>
+      <w:r>
+        <w:t xml:space="preserve">: El sistema debe mostrar un mapa con los núcleos agrarios </w:t>
+      </w:r>
+    </w:p>
+    <w:p>
+      <w:pPr>
+        <w:numPr>
+          <w:ilvl w:val="0"/>
+          <w:numId w:val="11"/>
+        </w:numPr>
+        <w:spacing w:after="160" w:line="278" w:lineRule="auto"/>
+      </w:pPr>
+      <w:r>
+        <w:rPr>
+          <w:b/>
+          <w:bCs/>
+        </w:rPr>
+        <w:t>RF-17</w:t>
+      </w:r>
+      <w:r>
+        <w:t xml:space="preserve">: El sistema debe mostrar el trazo del tren sobre el mapa </w:t>
+      </w:r>
+    </w:p>
+    <w:p>
+      <w:pPr>
+        <w:numPr>
+          <w:ilvl w:val="0"/>
+          <w:numId w:val="11"/>
+        </w:numPr>
+        <w:spacing w:after="160" w:line="278" w:lineRule="auto"/>
+      </w:pPr>
+      <w:r>
+        <w:rPr>
+          <w:b/>
+          <w:bCs/>
+        </w:rPr>
+        <w:t>RF-18</w:t>
+      </w:r>
+      <w:r>
+        <w:t xml:space="preserve">: El sistema debe colorear el tramo según el estado del núcleo </w:t>
+      </w:r>
+    </w:p>
+    <w:p>
+      <w:pPr>
+        <w:numPr>
+          <w:ilvl w:val="0"/>
+          <w:numId w:val="11"/>
+        </w:numPr>
+        <w:spacing w:after="160" w:line="278" w:lineRule="auto"/>
+      </w:pPr>
+      <w:r>
+        <w:rPr>
+          <w:b/>
+          <w:bCs/>
+        </w:rPr>
+        <w:t>RF-19</w:t>
+      </w:r>
+      <w:r>
+        <w:t xml:space="preserve">: El sistema debe permitir seleccionar un núcleo agrario en el mapa </w:t>
+      </w:r>
+    </w:p>
+    <w:p>
+      <w:pPr>
+        <w:numPr>
+          <w:ilvl w:val="0"/>
+          <w:numId w:val="11"/>
+        </w:numPr>
+        <w:spacing w:after="160" w:line="278" w:lineRule="auto"/>
+      </w:pPr>
+      <w:r>
+        <w:rPr>
+          <w:b/>
+          <w:bCs/>
+        </w:rPr>
+        <w:t>RF-20</w:t>
+      </w:r>
+      <w:r>
+        <w:t xml:space="preserve">: El sistema debe mostrar información del núcleo seleccionado </w:t>
+      </w:r>
+    </w:p>
+    <w:p>
+      <w:pPr>
+        <w:spacing w:after="160" w:line="278" w:lineRule="auto"/>
+        <w:ind w:left="720"/>
+      </w:pPr>
+    </w:p>
+    <w:p>
+      <w:pPr>
+        <w:pStyle w:val="Ttulo3"/>
+        <w:ind w:left="720" w:hanging="720"/>
+      </w:pPr>
+      <w:r>
+        <w:t xml:space="preserve">6.6 </w:t>
+      </w:r>
+      <w:r>
+        <w:t>Reportes</w:t>
+      </w:r>
+    </w:p>
+    <w:p>
+      <w:pPr>
+        <w:numPr>
+          <w:ilvl w:val="0"/>
+          <w:numId w:val="12"/>
+        </w:numPr>
+        <w:spacing w:after="160" w:line="278" w:lineRule="auto"/>
+      </w:pPr>
+      <w:r>
+        <w:rPr>
+          <w:b/>
+          <w:bCs/>
+        </w:rPr>
+        <w:t>RF-21</w:t>
+      </w:r>
+      <w:r>
+        <w:t xml:space="preserve">: El sistema debe generar reportes de avance por núcleo agrario </w:t>
+      </w:r>
+    </w:p>
+    <w:p>
+      <w:pPr>
+        <w:numPr>
+          <w:ilvl w:val="0"/>
+          <w:numId w:val="12"/>
+        </w:numPr>
+        <w:spacing w:after="160" w:line="278" w:lineRule="auto"/>
+      </w:pPr>
+      <w:r>
+        <w:rPr>
+          <w:b/>
+          <w:bCs/>
+        </w:rPr>
+        <w:t>RF-22</w:t>
+      </w:r>
+      <w:r>
+        <w:t xml:space="preserve">: El sistema debe mostrar gráficas de distribución (ej. tipo de propiedad) </w:t>
+      </w:r>
+    </w:p>
+    <w:p>
+      <w:pPr>
+        <w:numPr>
+          <w:ilvl w:val="0"/>
+          <w:numId w:val="12"/>
+        </w:numPr>
+        <w:spacing w:after="160" w:line="278" w:lineRule="auto"/>
+      </w:pPr>
+      <w:r>
+        <w:rPr>
+          <w:b/>
+          <w:bCs/>
+        </w:rPr>
+        <w:t>RF-23</w:t>
+      </w:r>
+      <w:r>
+        <w:t xml:space="preserve">: El sistema debe permitir exportar reportes en formato: </w:t>
+      </w:r>
+    </w:p>
+    <w:p>
+      <w:pPr>
+        <w:numPr>
+          <w:ilvl w:val="1"/>
+          <w:numId w:val="12"/>
+        </w:numPr>
+        <w:spacing w:after="160" w:line="278" w:lineRule="auto"/>
+      </w:pPr>
+      <w:r>
+        <w:t xml:space="preserve">XLSX </w:t>
+      </w:r>
+    </w:p>
+    <w:p>
+      <w:pPr>
+        <w:numPr>
+          <w:ilvl w:val="1"/>
+          <w:numId w:val="12"/>
+        </w:numPr>
+        <w:spacing w:after="160" w:line="278" w:lineRule="auto"/>
+      </w:pPr>
+      <w:r>
+        <w:t xml:space="preserve">PDF (opcional en esta fase) </w:t>
+      </w:r>
+    </w:p>
+    <w:p>
+      <w:pPr>
+        <w:pStyle w:val="Prrafodelista"/>
+        <w:numPr>
+          <w:ilvl w:val="0"/>
+          <w:numId w:val="12"/>
+        </w:numPr>
+        <w:spacing w:after="160" w:line="278" w:lineRule="auto"/>
+      </w:pPr>
+      <w:r>
+        <w:rPr>
+          <w:b/>
+          <w:bCs/>
+        </w:rPr>
+        <w:t>RF-2</w:t>
+      </w:r>
+      <w:r>
+        <w:rPr>
+          <w:b/>
+          <w:bCs/>
+        </w:rPr>
+        <w:t>4</w:t>
+      </w:r>
+      <w:r>
+        <w:t>: El sistema debe permitir ver el historial de cambios de un núcleo agrario</w:t>
+      </w:r>
+      <w:r>
+        <w:t xml:space="preserve"> (administrador ve)</w:t>
+      </w:r>
+    </w:p>
+    <w:p>
+      <w:pPr>
+        <w:pStyle w:val="Prrafodelista"/>
+        <w:numPr>
+          <w:ilvl w:val="0"/>
+          <w:numId w:val="12"/>
+        </w:numPr>
+        <w:spacing w:after="160" w:line="278" w:lineRule="auto"/>
+      </w:pPr>
+    </w:p>
+    <w:p>
+      <w:pPr>
+        <w:pStyle w:val="Prrafodelista"/>
+        <w:numPr>
+          <w:ilvl w:val="0"/>
+          <w:numId w:val="12"/>
+        </w:numPr>
+        <w:spacing w:after="160" w:line="278" w:lineRule="auto"/>
+      </w:pPr>
+      <w:r>
+        <w:rPr>
+          <w:b/>
+          <w:bCs/>
+        </w:rPr>
+        <w:t>RF-25</w:t>
+      </w:r>
+      <w:r>
+        <w:t>: El sistema debe mostrar mensajes cuando un usuario no tenga permisos</w:t>
+      </w:r>
+    </w:p>
+    <w:p>
+      <w:pPr>
+        <w:spacing w:after="160" w:line="278" w:lineRule="auto"/>
+      </w:pPr>
+    </w:p>
+    <w:p/>
+    <w:p>
+      <w:pPr>
+        <w:pStyle w:val="Ttulo2"/>
+      </w:pPr>
+      <w:bookmarkStart w:id="21" w:name="_bcvftnms1l62" w:colFirst="0" w:colLast="0"/>
+      <w:bookmarkEnd w:id="21"/>
+      <w:r>
+        <w:t>7. Requerimientos No Funcionales (RNF)</w:t>
       </w:r>
     </w:p>
     <w:p>
@@ -1061,7 +2552,14 @@
         <w:jc w:val="both"/>
       </w:pPr>
       <w:r>
-        <w:t>Registra información de campo.</w:t>
+        <w:rPr>
+          <w:b/>
+          <w:bCs/>
+        </w:rPr>
+        <w:t>RNF-01 Seguridad:</w:t>
+      </w:r>
+      <w:r>
+        <w:t xml:space="preserve"> El sistema debe bloquear cualquier intento de acceso a datos o funciones no permitidas por el rol del usuario, emitiendo un mensaje de restricción.</w:t>
       </w:r>
     </w:p>
     <w:p>
@@ -1074,7 +2572,15 @@
         <w:jc w:val="both"/>
       </w:pPr>
       <w:r>
-        <w:t>Actualiza el estatus de núcleos agrarios.</w:t>
+        <w:rPr>
+          <w:b/>
+          <w:bCs/>
+        </w:rPr>
+        <w:lastRenderedPageBreak/>
+        <w:t>RNF-02 Usabilidad:</w:t>
+      </w:r>
+      <w:r>
+        <w:t xml:space="preserve"> El mapa interactivo será de visualización estándar; no contará con funcionalidades de zoom libre o edición manual de la geometría por parte del usuario final para mantener la integridad del reporte.</w:t>
       </w:r>
     </w:p>
     <w:p>
@@ -1087,18 +2593,14 @@
         <w:jc w:val="both"/>
       </w:pPr>
       <w:r>
-        <w:lastRenderedPageBreak/>
-        <w:t>Solo accede a los tramos/núcleos que tiene asignados explícitamente.</w:t>
-      </w:r>
-    </w:p>
-    <w:p>
-      <w:pPr>
-        <w:pStyle w:val="Ttulo3"/>
-      </w:pPr>
-      <w:bookmarkStart w:id="9" w:name="_2ce6dtwonpi" w:colFirst="0" w:colLast="0"/>
-      <w:bookmarkEnd w:id="9"/>
-      <w:r>
-        <w:t>4.3 Analista / Lector</w:t>
+        <w:rPr>
+          <w:b/>
+          <w:bCs/>
+        </w:rPr>
+        <w:t>RNF-03 Persistencia:</w:t>
+      </w:r>
+      <w:r>
+        <w:t xml:space="preserve"> Toda la información capturada debe almacenarse de forma íntegra en la base de datos central para asegurar la consistencia de los reportes.</w:t>
       </w:r>
     </w:p>
     <w:p>
@@ -1111,33 +2613,14 @@
         <w:jc w:val="both"/>
       </w:pPr>
       <w:r>
-        <w:t>Solo consulta información.</w:t>
-      </w:r>
-    </w:p>
-    <w:p>
-      <w:pPr>
-        <w:numPr>
-          <w:ilvl w:val="0"/>
-          <w:numId w:val="2"/>
-        </w:numPr>
-        <w:spacing w:line="360" w:lineRule="auto"/>
-        <w:jc w:val="both"/>
-      </w:pPr>
-      <w:r>
-        <w:t>No tiene permisos para registrar ni modificar datos.</w:t>
-      </w:r>
-    </w:p>
-    <w:p>
-      <w:pPr>
-        <w:numPr>
-          <w:ilvl w:val="0"/>
-          <w:numId w:val="2"/>
-        </w:numPr>
-        <w:spacing w:line="360" w:lineRule="auto"/>
-        <w:jc w:val="both"/>
-      </w:pPr>
-      <w:r>
-        <w:t>Su función principal es la generación de reportes y visualización de avances.</w:t>
+        <w:rPr>
+          <w:b/>
+          <w:bCs/>
+        </w:rPr>
+        <w:t>RNF-04 Escalabilidad:</w:t>
+      </w:r>
+      <w:r>
+        <w:t xml:space="preserve"> La arquitectura debe permitir la incorporación futura de exportación en formato PDF y reportes detallados por parcelas individuales.</w:t>
       </w:r>
     </w:p>
     <w:p>
@@ -1152,666 +2635,44 @@
         </w:pBdr>
       </w:pPr>
     </w:p>
-    <w:p>
-      <w:r>
-        <w:pict w14:anchorId="1C3A8472">
-          <v:rect id="_x0000_i1028" style="width:0;height:1.5pt" o:hralign="center" o:hrstd="t" o:hr="t" fillcolor="#a0a0a0" stroked="f"/>
-        </w:pict>
-      </w:r>
-    </w:p>
+    <w:p/>
+    <w:p/>
+    <w:p/>
+    <w:p/>
+    <w:p/>
     <w:p>
       <w:pPr>
         <w:pStyle w:val="Ttulo2"/>
       </w:pPr>
-      <w:bookmarkStart w:id="10" w:name="_92kyr9ia3lei" w:colFirst="0" w:colLast="0"/>
-      <w:bookmarkEnd w:id="10"/>
-      <w:r>
-        <w:t>5. Reglas de Negocio (RN)</w:t>
+      <w:bookmarkStart w:id="22" w:name="_dihqeme2cigd" w:colFirst="0" w:colLast="0"/>
+      <w:bookmarkEnd w:id="22"/>
+      <w:r>
+        <w:t>8. Modelos del Sistema</w:t>
       </w:r>
     </w:p>
     <w:p>
       <w:pPr>
         <w:pStyle w:val="Ttulo3"/>
       </w:pPr>
-      <w:bookmarkStart w:id="11" w:name="_ywuc585ugfix" w:colFirst="0" w:colLast="0"/>
-      <w:bookmarkEnd w:id="11"/>
-      <w:r>
-        <w:t>5.1 Control de Acceso</w:t>
-      </w:r>
-    </w:p>
-    <w:p>
-      <w:pPr>
-        <w:numPr>
-          <w:ilvl w:val="0"/>
-          <w:numId w:val="2"/>
-        </w:numPr>
-        <w:spacing w:line="360" w:lineRule="auto"/>
-        <w:jc w:val="both"/>
-      </w:pPr>
-      <w:r>
-        <w:rPr>
-          <w:b/>
-          <w:bCs/>
-        </w:rPr>
-        <w:t>RN-01:</w:t>
-      </w:r>
-      <w:r>
-        <w:t xml:space="preserve"> Todo usuario debe autenticarse mediante credenciales válidas para acceder al sistema.</w:t>
-      </w:r>
-    </w:p>
-    <w:p>
-      <w:pPr>
-        <w:numPr>
-          <w:ilvl w:val="0"/>
-          <w:numId w:val="2"/>
-        </w:numPr>
-        <w:spacing w:line="360" w:lineRule="auto"/>
-        <w:jc w:val="both"/>
-      </w:pPr>
-      <w:r>
-        <w:rPr>
-          <w:b/>
-          <w:bCs/>
-        </w:rPr>
-        <w:t>RN-02:</w:t>
-      </w:r>
-      <w:r>
-        <w:t xml:space="preserve"> El acceso a las funcionalidades y datos depende estrictamente del rol asignado al usuario.</w:t>
-      </w:r>
-    </w:p>
-    <w:p>
-      <w:pPr>
-        <w:numPr>
-          <w:ilvl w:val="0"/>
-          <w:numId w:val="2"/>
-        </w:numPr>
-        <w:spacing w:line="360" w:lineRule="auto"/>
-        <w:jc w:val="both"/>
-      </w:pPr>
-      <w:r>
-        <w:rPr>
-          <w:b/>
-          <w:bCs/>
-        </w:rPr>
-        <w:t>RN-03:</w:t>
-      </w:r>
-      <w:r>
-        <w:t xml:space="preserve"> Un Analista/Lector tiene restringida la creación o modificación de información.</w:t>
-      </w:r>
-    </w:p>
-    <w:p>
-      <w:pPr>
-        <w:numPr>
-          <w:ilvl w:val="0"/>
-          <w:numId w:val="2"/>
-        </w:numPr>
-        <w:spacing w:line="360" w:lineRule="auto"/>
-        <w:jc w:val="both"/>
-      </w:pPr>
-      <w:r>
-        <w:rPr>
-          <w:b/>
-          <w:bCs/>
-        </w:rPr>
-        <w:t>RN-04:</w:t>
-      </w:r>
-      <w:r>
-        <w:t xml:space="preserve"> Un Operador solo puede capturar o modificar datos de los núcleos que le han sido asignados.</w:t>
-      </w:r>
-    </w:p>
-    <w:p>
-      <w:pPr>
-        <w:numPr>
-          <w:ilvl w:val="0"/>
-          <w:numId w:val="2"/>
-        </w:numPr>
-        <w:spacing w:line="360" w:lineRule="auto"/>
-        <w:jc w:val="both"/>
-      </w:pPr>
-      <w:r>
-        <w:rPr>
-          <w:b/>
-          <w:bCs/>
-        </w:rPr>
-        <w:t>RN-05:</w:t>
-      </w:r>
-      <w:r>
-        <w:t xml:space="preserve"> El Administrador posee facultades para acceder y modificar cualquier registro dentro de la plataforma.</w:t>
-      </w:r>
-    </w:p>
-    <w:p>
-      <w:pPr>
-        <w:pStyle w:val="Ttulo3"/>
-      </w:pPr>
-      <w:bookmarkStart w:id="12" w:name="_d8el1ii4hs92" w:colFirst="0" w:colLast="0"/>
-      <w:bookmarkEnd w:id="12"/>
-      <w:r>
-        <w:t xml:space="preserve">5.2 Gestión de Núcleos Agrarios </w:t>
-      </w:r>
-    </w:p>
-    <w:p>
-      <w:pPr>
-        <w:numPr>
-          <w:ilvl w:val="0"/>
-          <w:numId w:val="2"/>
-        </w:numPr>
-        <w:spacing w:line="360" w:lineRule="auto"/>
-        <w:jc w:val="both"/>
-      </w:pPr>
-      <w:r>
-        <w:rPr>
-          <w:b/>
-          <w:bCs/>
-        </w:rPr>
-        <w:t>RN-06:</w:t>
-      </w:r>
-      <w:r>
-        <w:t xml:space="preserve"> Cada núcleo agrario se representa cartográficamente mediante un único polígono cerrado.</w:t>
-      </w:r>
-    </w:p>
-    <w:p>
-      <w:pPr>
-        <w:numPr>
-          <w:ilvl w:val="0"/>
-          <w:numId w:val="2"/>
-        </w:numPr>
-        <w:spacing w:line="360" w:lineRule="auto"/>
-        <w:jc w:val="both"/>
-      </w:pPr>
-      <w:r>
-        <w:rPr>
-          <w:b/>
-          <w:bCs/>
-        </w:rPr>
-        <w:t>RN-07:</w:t>
-      </w:r>
-      <w:r>
-        <w:t xml:space="preserve"> Un núcleo agrario puede ser atravesado por el trazo del tren en múltiples puntos o segmentos.</w:t>
-      </w:r>
-    </w:p>
-    <w:p>
-      <w:pPr>
-        <w:numPr>
-          <w:ilvl w:val="0"/>
-          <w:numId w:val="5"/>
-        </w:numPr>
-        <w:spacing w:after="160" w:line="278" w:lineRule="auto"/>
-      </w:pPr>
-      <w:r>
-        <w:rPr>
-          <w:b/>
-          <w:bCs/>
-        </w:rPr>
-        <w:t>RN-08:</w:t>
-      </w:r>
-      <w:r>
-        <w:t xml:space="preserve"> El estado del núcleo agrario es único; </w:t>
-      </w:r>
-      <w:r>
-        <w:t>(no puede haber múltiples estados dentro del mismo núcleo)</w:t>
-      </w:r>
-      <w:r>
-        <w:t>.</w:t>
-      </w:r>
-    </w:p>
-    <w:p>
-      <w:pPr>
-        <w:pStyle w:val="Ttulo3"/>
-      </w:pPr>
-      <w:r>
-        <w:t>5.3 Estado del Tramo</w:t>
-      </w:r>
-    </w:p>
-    <w:p>
-      <w:pPr>
-        <w:numPr>
-          <w:ilvl w:val="0"/>
-          <w:numId w:val="2"/>
-        </w:numPr>
-        <w:spacing w:line="360" w:lineRule="auto"/>
-        <w:jc w:val="both"/>
-      </w:pPr>
-      <w:r>
-        <w:rPr>
-          <w:b/>
-          <w:bCs/>
-        </w:rPr>
-        <w:t>RN-09:</w:t>
-      </w:r>
-      <w:r>
-        <w:t xml:space="preserve"> El estado visual del tramo (línea del tren) dentro de un núcleo depende directamente del estado legal y administrativo de dicho núcleo.</w:t>
-      </w:r>
-    </w:p>
-    <w:p>
-      <w:pPr>
-        <w:numPr>
-          <w:ilvl w:val="0"/>
-          <w:numId w:val="2"/>
-        </w:numPr>
-        <w:spacing w:line="360" w:lineRule="auto"/>
-        <w:jc w:val="both"/>
-      </w:pPr>
-      <w:r>
-        <w:rPr>
-          <w:b/>
-          <w:bCs/>
-        </w:rPr>
-        <w:t>RN-10:</w:t>
-      </w:r>
-      <w:r>
-        <w:t xml:space="preserve"> Los estados posibles para un núcleo/tramo son:</w:t>
-      </w:r>
-    </w:p>
-    <w:p>
-      <w:pPr>
-        <w:numPr>
-          <w:ilvl w:val="1"/>
-          <w:numId w:val="2"/>
-        </w:numPr>
-        <w:spacing w:line="360" w:lineRule="auto"/>
-        <w:jc w:val="both"/>
-      </w:pPr>
-      <w:r>
-        <w:rPr>
-          <w:b/>
-          <w:bCs/>
-        </w:rPr>
-        <w:lastRenderedPageBreak/>
-        <w:t>Liberado (verde):</w:t>
-      </w:r>
-      <w:r>
-        <w:t xml:space="preserve"> Proceso concluido y listo para construcción.</w:t>
-      </w:r>
-    </w:p>
-    <w:p>
-      <w:pPr>
-        <w:numPr>
-          <w:ilvl w:val="1"/>
-          <w:numId w:val="2"/>
-        </w:numPr>
-        <w:spacing w:line="360" w:lineRule="auto"/>
-        <w:jc w:val="both"/>
-      </w:pPr>
-      <w:r>
-        <w:rPr>
-          <w:b/>
-          <w:bCs/>
-        </w:rPr>
-        <w:t>Pendiente (gris):</w:t>
-      </w:r>
-      <w:r>
-        <w:t xml:space="preserve"> Proceso no iniciado o sin contacto con ejidatarios.</w:t>
-      </w:r>
-    </w:p>
-    <w:p>
-      <w:pPr>
-        <w:numPr>
-          <w:ilvl w:val="1"/>
-          <w:numId w:val="2"/>
-        </w:numPr>
-        <w:spacing w:line="360" w:lineRule="auto"/>
-        <w:jc w:val="both"/>
-      </w:pPr>
-      <w:r>
-        <w:rPr>
-          <w:b/>
-          <w:bCs/>
-        </w:rPr>
-        <w:t>Problema (rojo):</w:t>
-      </w:r>
-      <w:r>
-        <w:t xml:space="preserve"> Conflictos detectados con ejidatarios o con el terreno.</w:t>
-      </w:r>
-    </w:p>
-    <w:p>
-      <w:pPr>
-        <w:pStyle w:val="Ttulo3"/>
-      </w:pPr>
-      <w:bookmarkStart w:id="13" w:name="_v32grwonix08" w:colFirst="0" w:colLast="0"/>
-      <w:bookmarkEnd w:id="13"/>
-      <w:r>
-        <w:t>5.</w:t>
-      </w:r>
-      <w:r>
-        <w:t>4</w:t>
-      </w:r>
-      <w:r>
-        <w:t xml:space="preserve"> Asambleas y </w:t>
-      </w:r>
-      <w:r>
-        <w:t>Convenios</w:t>
-      </w:r>
-    </w:p>
-    <w:p>
-      <w:pPr>
-        <w:numPr>
-          <w:ilvl w:val="0"/>
-          <w:numId w:val="2"/>
-        </w:numPr>
-        <w:spacing w:line="360" w:lineRule="auto"/>
-        <w:jc w:val="both"/>
-      </w:pPr>
-      <w:r>
-        <w:rPr>
-          <w:b/>
-          <w:bCs/>
-        </w:rPr>
-        <w:t>RN-11:</w:t>
-      </w:r>
-      <w:r>
-        <w:t xml:space="preserve"> Para cada núcleo agrario es obligatorio registrar</w:t>
-      </w:r>
-      <w:r>
-        <w:t>:</w:t>
-      </w:r>
-    </w:p>
-    <w:p>
-      <w:pPr>
-        <w:numPr>
-          <w:ilvl w:val="1"/>
-          <w:numId w:val="2"/>
-        </w:numPr>
-        <w:spacing w:after="160" w:line="360" w:lineRule="auto"/>
-        <w:jc w:val="both"/>
-      </w:pPr>
-      <w:r>
-        <w:t xml:space="preserve">Asambleas programadas </w:t>
-      </w:r>
-    </w:p>
-    <w:p>
-      <w:pPr>
-        <w:numPr>
-          <w:ilvl w:val="1"/>
-          <w:numId w:val="2"/>
-        </w:numPr>
-        <w:spacing w:after="160" w:line="360" w:lineRule="auto"/>
-        <w:jc w:val="both"/>
-      </w:pPr>
-      <w:r>
-        <w:t xml:space="preserve">Asambleas convocadas </w:t>
-      </w:r>
-    </w:p>
-    <w:p>
-      <w:pPr>
-        <w:numPr>
-          <w:ilvl w:val="1"/>
-          <w:numId w:val="2"/>
-        </w:numPr>
-        <w:spacing w:after="160" w:line="360" w:lineRule="auto"/>
-        <w:jc w:val="both"/>
-      </w:pPr>
-      <w:r>
-        <w:t xml:space="preserve">Asambleas realizadas con autorización </w:t>
-      </w:r>
-    </w:p>
-    <w:p>
-      <w:pPr>
-        <w:numPr>
-          <w:ilvl w:val="1"/>
-          <w:numId w:val="2"/>
-        </w:numPr>
-        <w:spacing w:after="160" w:line="360" w:lineRule="auto"/>
-        <w:jc w:val="both"/>
-      </w:pPr>
-      <w:r>
-        <w:t>Convenios firmados</w:t>
-      </w:r>
-    </w:p>
-    <w:p>
-      <w:pPr>
-        <w:numPr>
-          <w:ilvl w:val="0"/>
-          <w:numId w:val="2"/>
-        </w:numPr>
-        <w:spacing w:line="360" w:lineRule="auto"/>
-        <w:jc w:val="both"/>
-      </w:pPr>
-      <w:r>
-        <w:rPr>
-          <w:b/>
-          <w:bCs/>
-        </w:rPr>
-        <w:t>RN-12:</w:t>
-      </w:r>
-      <w:r>
-        <w:t xml:space="preserve"> </w:t>
-      </w:r>
-      <w:r>
-        <w:t>El estado del núcleo agrario depende del avance de estos indicadores (definición pendiente)</w:t>
-      </w:r>
-      <w:r>
-        <w:t>.</w:t>
-      </w:r>
-    </w:p>
-    <w:p>
-      <w:pPr>
-        <w:pStyle w:val="Ttulo3"/>
-      </w:pPr>
-      <w:bookmarkStart w:id="14" w:name="_55ozgjcgfo5" w:colFirst="0" w:colLast="0"/>
-      <w:bookmarkEnd w:id="14"/>
-      <w:r>
-        <w:t>5.</w:t>
-      </w:r>
-      <w:r>
-        <w:t>5</w:t>
-      </w:r>
-      <w:r>
-        <w:t xml:space="preserve"> </w:t>
-      </w:r>
-      <w:r>
-        <w:t>Datos y consistencia</w:t>
-      </w:r>
-    </w:p>
-    <w:p>
-      <w:pPr>
-        <w:numPr>
-          <w:ilvl w:val="0"/>
-          <w:numId w:val="2"/>
-        </w:numPr>
-        <w:spacing w:line="360" w:lineRule="auto"/>
-        <w:jc w:val="both"/>
-      </w:pPr>
-      <w:r>
-        <w:rPr>
-          <w:b/>
-          <w:bCs/>
-        </w:rPr>
-        <w:t>RN-1</w:t>
-      </w:r>
-      <w:r>
-        <w:rPr>
-          <w:b/>
-          <w:bCs/>
-        </w:rPr>
-        <w:t>3</w:t>
-      </w:r>
-      <w:r>
-        <w:rPr>
-          <w:b/>
-          <w:bCs/>
-        </w:rPr>
-        <w:t>:</w:t>
-      </w:r>
-      <w:r>
-        <w:t xml:space="preserve"> </w:t>
-      </w:r>
-      <w:r>
-        <w:t>Toda la información capturada debe almacenarse en la base de datos del sistema</w:t>
-      </w:r>
-      <w:r>
-        <w:t>.</w:t>
-      </w:r>
-    </w:p>
-    <w:p>
-      <w:pPr>
-        <w:numPr>
-          <w:ilvl w:val="0"/>
-          <w:numId w:val="2"/>
-        </w:numPr>
-        <w:spacing w:line="360" w:lineRule="auto"/>
-        <w:jc w:val="both"/>
-      </w:pPr>
-      <w:r>
-        <w:rPr>
-          <w:b/>
-          <w:bCs/>
-        </w:rPr>
-        <w:t>RN-1</w:t>
-      </w:r>
-      <w:r>
-        <w:rPr>
-          <w:b/>
-          <w:bCs/>
-        </w:rPr>
-        <w:t>4</w:t>
-      </w:r>
-      <w:r>
-        <w:rPr>
-          <w:b/>
-          <w:bCs/>
-        </w:rPr>
-        <w:t>:</w:t>
-      </w:r>
-      <w:r>
-        <w:t xml:space="preserve"> </w:t>
-      </w:r>
-      <w:r>
-        <w:t>El sistema debe permitir generar reportes con la información actual</w:t>
-      </w:r>
-      <w:r>
-        <w:t>.</w:t>
-      </w:r>
-    </w:p>
-    <w:p>
-      <w:pPr>
-        <w:numPr>
-          <w:ilvl w:val="0"/>
-          <w:numId w:val="2"/>
-        </w:numPr>
-        <w:spacing w:line="360" w:lineRule="auto"/>
-        <w:jc w:val="both"/>
-      </w:pPr>
-      <w:r>
-        <w:rPr>
-          <w:b/>
-          <w:bCs/>
-        </w:rPr>
-        <w:t>RN-1</w:t>
-      </w:r>
-      <w:r>
-        <w:rPr>
-          <w:b/>
-          <w:bCs/>
-        </w:rPr>
-        <w:t>5</w:t>
-      </w:r>
-      <w:r>
-        <w:rPr>
-          <w:b/>
-          <w:bCs/>
-        </w:rPr>
-        <w:t>:</w:t>
-      </w:r>
-      <w:r>
-        <w:t xml:space="preserve"> </w:t>
-      </w:r>
-      <w:r>
-        <w:t>El sistema debe registrar cambios realizados por los usuarios (auditoría básica – pendiente detalle)</w:t>
-      </w:r>
-      <w:r>
-        <w:t>.</w:t>
-      </w:r>
-    </w:p>
-    <w:p>
-      <w:pPr>
-        <w:pStyle w:val="Ttulo3"/>
-      </w:pPr>
-      <w:r>
-        <w:t>5.6</w:t>
-      </w:r>
-      <w:r>
-        <w:t xml:space="preserve"> Visualización</w:t>
-      </w:r>
-    </w:p>
-    <w:p>
-      <w:pPr>
-        <w:numPr>
-          <w:ilvl w:val="0"/>
-          <w:numId w:val="6"/>
-        </w:numPr>
-        <w:spacing w:after="160" w:line="278" w:lineRule="auto"/>
-      </w:pPr>
-      <w:r>
-        <w:rPr>
-          <w:b/>
-          <w:bCs/>
-        </w:rPr>
-        <w:t>RN-16</w:t>
-      </w:r>
-      <w:r>
-        <w:t xml:space="preserve">: El mapa debe mostrar: </w:t>
-      </w:r>
-    </w:p>
-    <w:p>
-      <w:pPr>
-        <w:numPr>
-          <w:ilvl w:val="1"/>
-          <w:numId w:val="6"/>
-        </w:numPr>
-        <w:spacing w:after="160" w:line="278" w:lineRule="auto"/>
-      </w:pPr>
-      <w:r>
-        <w:t xml:space="preserve">Núcleos agrarios (polígonos) </w:t>
-      </w:r>
-    </w:p>
-    <w:p>
-      <w:pPr>
-        <w:numPr>
-          <w:ilvl w:val="1"/>
-          <w:numId w:val="6"/>
-        </w:numPr>
-        <w:spacing w:after="160" w:line="278" w:lineRule="auto"/>
-      </w:pPr>
-      <w:r>
-        <w:t xml:space="preserve">Tramo del tren (línea) </w:t>
-      </w:r>
-    </w:p>
-    <w:p>
-      <w:pPr>
-        <w:numPr>
-          <w:ilvl w:val="0"/>
-          <w:numId w:val="6"/>
-        </w:numPr>
-        <w:spacing w:after="160" w:line="278" w:lineRule="auto"/>
-      </w:pPr>
-      <w:r>
-        <w:rPr>
-          <w:b/>
-          <w:bCs/>
-        </w:rPr>
-        <w:t>RN-17</w:t>
-      </w:r>
-      <w:r>
-        <w:t xml:space="preserve">: El tramo debe colorearse según el estado del núcleo agrario correspondiente </w:t>
-      </w:r>
-    </w:p>
-    <w:p>
-      <w:pPr>
-        <w:numPr>
-          <w:ilvl w:val="0"/>
-          <w:numId w:val="6"/>
-        </w:numPr>
-        <w:spacing w:after="160" w:line="278" w:lineRule="auto"/>
-      </w:pPr>
-      <w:r>
-        <w:rPr>
-          <w:b/>
-          <w:bCs/>
-        </w:rPr>
-        <w:t>RN-18</w:t>
-      </w:r>
-      <w:r>
-        <w:t xml:space="preserve">: Un mismo núcleo puede aparecer múltiples veces en el trazo </w:t>
+      <w:bookmarkStart w:id="23" w:name="_kc3jw8d7mlns" w:colFirst="0" w:colLast="0"/>
+      <w:bookmarkEnd w:id="23"/>
+      <w:r>
+        <w:t>8.1 Modelo de Datos (Sugerencia)</w:t>
+      </w:r>
+    </w:p>
+    <w:p>
+      <w:r>
+        <w:t xml:space="preserve">El modelo debe centrarse en la entidad </w:t>
+      </w:r>
+      <w:r>
+        <w:rPr>
+          <w:b/>
+          <w:bCs/>
+        </w:rPr>
+        <w:t>Núcleo Agrario</w:t>
+      </w:r>
+      <w:r>
+        <w:t>, la cual se vincula con:</w:t>
       </w:r>
     </w:p>
     <w:p>
@@ -1827,257 +2688,82 @@
       </w:pPr>
     </w:p>
     <w:p>
-      <w:r>
-        <w:pict w14:anchorId="0BF7D073">
-          <v:rect id="_x0000_i1029" style="width:0;height:1.5pt" o:hralign="center" o:hrstd="t" o:hr="t" fillcolor="#a0a0a0" stroked="f"/>
-        </w:pict>
-      </w:r>
-    </w:p>
-    <w:p>
-      <w:pPr>
-        <w:pStyle w:val="Ttulo2"/>
-      </w:pPr>
-      <w:bookmarkStart w:id="15" w:name="_z3dhqx4787r5" w:colFirst="0" w:colLast="0"/>
-      <w:bookmarkEnd w:id="15"/>
-      <w:r>
-        <w:lastRenderedPageBreak/>
-        <w:t>6. Requerimientos Funcionales (RF)</w:t>
+      <w:pPr>
+        <w:numPr>
+          <w:ilvl w:val="0"/>
+          <w:numId w:val="2"/>
+        </w:numPr>
+      </w:pPr>
+      <w:r>
+        <w:rPr>
+          <w:b/>
+          <w:bCs/>
+        </w:rPr>
+        <w:t>Asambleas:</w:t>
+      </w:r>
+      <w:r>
+        <w:t xml:space="preserve"> Relación uno a muchos para registrar el historial legal.</w:t>
+      </w:r>
+    </w:p>
+    <w:p>
+      <w:pPr>
+        <w:numPr>
+          <w:ilvl w:val="0"/>
+          <w:numId w:val="2"/>
+        </w:numPr>
+      </w:pPr>
+      <w:r>
+        <w:rPr>
+          <w:b/>
+          <w:bCs/>
+        </w:rPr>
+        <w:t>Segmentos de Tramo:</w:t>
+      </w:r>
+      <w:r>
+        <w:t xml:space="preserve"> Relación uno a muchos que define qué partes de la línea ferroviaria atraviesan cada núcleo.</w:t>
+      </w:r>
+    </w:p>
+    <w:p>
+      <w:pPr>
+        <w:numPr>
+          <w:ilvl w:val="0"/>
+          <w:numId w:val="2"/>
+        </w:numPr>
+      </w:pPr>
+      <w:r>
+        <w:rPr>
+          <w:b/>
+          <w:bCs/>
+        </w:rPr>
+        <w:t>Atributos Geográficos:</w:t>
+      </w:r>
+      <w:r>
+        <w:t xml:space="preserve"> Uso de tipos de datos espaciales (Polígonos para núcleos, Líneas para tramos).</w:t>
       </w:r>
     </w:p>
     <w:p>
       <w:pPr>
         <w:pStyle w:val="Ttulo3"/>
       </w:pPr>
-      <w:bookmarkStart w:id="16" w:name="_mhzw5evw1aox" w:colFirst="0" w:colLast="0"/>
-      <w:bookmarkEnd w:id="16"/>
-      <w:r>
-        <w:t xml:space="preserve">6.1 Autenticación </w:t>
-      </w:r>
-    </w:p>
-    <w:p>
-      <w:pPr>
-        <w:numPr>
-          <w:ilvl w:val="0"/>
-          <w:numId w:val="7"/>
-        </w:numPr>
-        <w:spacing w:after="160" w:line="278" w:lineRule="auto"/>
-      </w:pPr>
-      <w:bookmarkStart w:id="17" w:name="_wctwlqsf30e" w:colFirst="0" w:colLast="0"/>
-      <w:bookmarkEnd w:id="17"/>
-      <w:r>
-        <w:rPr>
-          <w:b/>
-          <w:bCs/>
-        </w:rPr>
-        <w:t>RF-01</w:t>
-      </w:r>
-      <w:r>
-        <w:t xml:space="preserve">: El sistema debe permitir a los usuarios iniciar sesión con correo y contraseña </w:t>
-      </w:r>
-    </w:p>
-    <w:p>
-      <w:pPr>
-        <w:numPr>
-          <w:ilvl w:val="0"/>
-          <w:numId w:val="7"/>
-        </w:numPr>
-        <w:spacing w:after="160" w:line="278" w:lineRule="auto"/>
-      </w:pPr>
-      <w:r>
-        <w:rPr>
-          <w:b/>
-          <w:bCs/>
-        </w:rPr>
-        <w:t>RF-02</w:t>
-      </w:r>
-      <w:r>
-        <w:t xml:space="preserve">: El sistema debe permitir recuperar contraseña </w:t>
-      </w:r>
-    </w:p>
-    <w:p>
-      <w:pPr>
-        <w:numPr>
-          <w:ilvl w:val="0"/>
-          <w:numId w:val="7"/>
-        </w:numPr>
-        <w:spacing w:after="160" w:line="278" w:lineRule="auto"/>
-      </w:pPr>
-      <w:r>
-        <w:rPr>
-          <w:b/>
-          <w:bCs/>
-        </w:rPr>
-        <w:t>RF-03</w:t>
-      </w:r>
-      <w:r>
-        <w:t xml:space="preserve">: El sistema debe mantener sesión activa del usuario </w:t>
-      </w:r>
-    </w:p>
-    <w:p>
-      <w:pPr>
-        <w:pStyle w:val="Ttulo3"/>
-      </w:pPr>
-      <w:r>
-        <w:t xml:space="preserve">6.2 </w:t>
-      </w:r>
-      <w:bookmarkStart w:id="18" w:name="_ozx43kq1htt4" w:colFirst="0" w:colLast="0"/>
-      <w:bookmarkEnd w:id="18"/>
-      <w:r>
-        <w:t>Gestión de usuarios</w:t>
-      </w:r>
-    </w:p>
-    <w:p>
-      <w:pPr>
-        <w:pStyle w:val="Prrafodelista"/>
-        <w:numPr>
-          <w:ilvl w:val="0"/>
-          <w:numId w:val="8"/>
-        </w:numPr>
-        <w:spacing w:line="360" w:lineRule="auto"/>
-        <w:jc w:val="both"/>
-      </w:pPr>
-      <w:r>
-        <w:rPr>
-          <w:b/>
-          <w:bCs/>
-        </w:rPr>
-        <w:t>RF-04</w:t>
-      </w:r>
-      <w:r>
-        <w:t xml:space="preserve">: El sistema debe permitir al Administrador crear usuarios </w:t>
-      </w:r>
-    </w:p>
-    <w:p>
-      <w:pPr>
-        <w:pStyle w:val="Prrafodelista"/>
-        <w:numPr>
-          <w:ilvl w:val="0"/>
-          <w:numId w:val="8"/>
-        </w:numPr>
-        <w:spacing w:line="360" w:lineRule="auto"/>
-        <w:jc w:val="both"/>
-      </w:pPr>
-      <w:r>
-        <w:rPr>
-          <w:b/>
-          <w:bCs/>
-        </w:rPr>
-        <w:t>RF-05</w:t>
-      </w:r>
-      <w:r>
-        <w:t xml:space="preserve">: El sistema debe permitir asignar roles a usuarios </w:t>
-      </w:r>
-    </w:p>
-    <w:p>
-      <w:pPr>
-        <w:pStyle w:val="Prrafodelista"/>
-        <w:numPr>
-          <w:ilvl w:val="0"/>
-          <w:numId w:val="8"/>
-        </w:numPr>
-        <w:spacing w:line="360" w:lineRule="auto"/>
-        <w:jc w:val="both"/>
-      </w:pPr>
-      <w:r>
-        <w:rPr>
-          <w:b/>
-          <w:bCs/>
-        </w:rPr>
-        <w:t>RF-06</w:t>
-      </w:r>
-      <w:r>
-        <w:t xml:space="preserve">: El sistema debe permitir editar usuarios </w:t>
-      </w:r>
-    </w:p>
-    <w:p>
-      <w:pPr>
-        <w:pStyle w:val="Prrafodelista"/>
-        <w:numPr>
-          <w:ilvl w:val="0"/>
-          <w:numId w:val="8"/>
-        </w:numPr>
-        <w:spacing w:line="360" w:lineRule="auto"/>
-        <w:jc w:val="both"/>
-      </w:pPr>
-      <w:r>
-        <w:rPr>
-          <w:b/>
-          <w:bCs/>
-        </w:rPr>
-        <w:t>RF-07</w:t>
-      </w:r>
-      <w:r>
-        <w:t xml:space="preserve">: El sistema debe permitir desactivar usuarios </w:t>
-      </w:r>
-    </w:p>
-    <w:p>
-      <w:pPr>
-        <w:pStyle w:val="Ttulo3"/>
-      </w:pPr>
-      <w:r>
-        <w:t xml:space="preserve">6.3 </w:t>
-      </w:r>
-      <w:bookmarkStart w:id="19" w:name="_4kdk4klqkjw1" w:colFirst="0" w:colLast="0"/>
-      <w:bookmarkEnd w:id="19"/>
-      <w:r>
-        <w:t>Gestión de núcleos agrarios</w:t>
-      </w:r>
-    </w:p>
-    <w:p>
-      <w:pPr>
-        <w:numPr>
-          <w:ilvl w:val="0"/>
-          <w:numId w:val="9"/>
-        </w:numPr>
-        <w:spacing w:after="160" w:line="278" w:lineRule="auto"/>
-      </w:pPr>
-      <w:r>
-        <w:rPr>
-          <w:b/>
-          <w:bCs/>
-        </w:rPr>
-        <w:t>RF-08</w:t>
-      </w:r>
-      <w:r>
-        <w:t xml:space="preserve">: El sistema debe permitir registrar núcleos agrarios </w:t>
-      </w:r>
-    </w:p>
-    <w:p>
-      <w:pPr>
-        <w:numPr>
-          <w:ilvl w:val="0"/>
-          <w:numId w:val="9"/>
-        </w:numPr>
-        <w:spacing w:after="160" w:line="278" w:lineRule="auto"/>
-      </w:pPr>
-      <w:r>
-        <w:rPr>
-          <w:b/>
-          <w:bCs/>
-        </w:rPr>
-        <w:t>RF-09</w:t>
-      </w:r>
-      <w:r>
-        <w:t xml:space="preserve">: El sistema debe permitir visualizar núcleos agrarios </w:t>
-      </w:r>
-    </w:p>
-    <w:p>
-      <w:pPr>
-        <w:numPr>
-          <w:ilvl w:val="0"/>
-          <w:numId w:val="9"/>
-        </w:numPr>
-        <w:spacing w:after="160" w:line="278" w:lineRule="auto"/>
-      </w:pPr>
-      <w:r>
-        <w:rPr>
-          <w:b/>
-          <w:bCs/>
-        </w:rPr>
-        <w:t>RF-10</w:t>
-      </w:r>
-      <w:r>
-        <w:t xml:space="preserve">: El sistema debe permitir actualizar información de núcleos (solo </w:t>
+      <w:bookmarkStart w:id="24" w:name="_y2np0f4uv3fy" w:colFirst="0" w:colLast="0"/>
+      <w:bookmarkEnd w:id="24"/>
+      <w:r>
+        <w:t>8.2 Modelo de Comportamiento</w:t>
+      </w:r>
+    </w:p>
+    <w:p>
+      <w:r>
+        <w:t xml:space="preserve">Se recomienda el uso de </w:t>
+      </w:r>
+      <w:r>
+        <w:rPr>
+          <w:b/>
+          <w:bCs/>
+        </w:rPr>
+        <w:t>Diagramas de Casos de Uso</w:t>
+      </w:r>
+      <w:r>
+        <w:t xml:space="preserve"> de UML para modelar las interacciones de los tres roles (</w:t>
       </w:r>
       <w:proofErr w:type="spellStart"/>
       <w:r>
@@ -2085,431 +2771,7 @@
       </w:r>
       <w:proofErr w:type="spellEnd"/>
       <w:r>
-        <w:t xml:space="preserve"> y Operador autorizado) </w:t>
-      </w:r>
-    </w:p>
-    <w:p>
-      <w:pPr>
-        <w:numPr>
-          <w:ilvl w:val="0"/>
-          <w:numId w:val="9"/>
-        </w:numPr>
-        <w:spacing w:after="160" w:line="278" w:lineRule="auto"/>
-      </w:pPr>
-      <w:r>
-        <w:rPr>
-          <w:b/>
-          <w:bCs/>
-        </w:rPr>
-        <w:t>RF-11</w:t>
-      </w:r>
-      <w:r>
-        <w:t xml:space="preserve">: El sistema debe mostrar el estado actual del núcleo </w:t>
-      </w:r>
-    </w:p>
-    <w:p>
-      <w:pPr>
-        <w:pStyle w:val="Ttulo3"/>
-      </w:pPr>
-      <w:r>
-        <w:t xml:space="preserve">6.4 </w:t>
-      </w:r>
-      <w:bookmarkStart w:id="20" w:name="_qvysnpmkj" w:colFirst="0" w:colLast="0"/>
-      <w:bookmarkEnd w:id="20"/>
-      <w:r>
-        <w:t>Captura de información (Operador)</w:t>
-      </w:r>
-    </w:p>
-    <w:p>
-      <w:pPr>
-        <w:numPr>
-          <w:ilvl w:val="0"/>
-          <w:numId w:val="10"/>
-        </w:numPr>
-        <w:spacing w:after="160" w:line="278" w:lineRule="auto"/>
-      </w:pPr>
-      <w:r>
-        <w:rPr>
-          <w:b/>
-          <w:bCs/>
-        </w:rPr>
-        <w:t>RF-12</w:t>
-      </w:r>
-      <w:r>
-        <w:t xml:space="preserve">: El sistema debe permitir registrar información de un núcleo agrario (formulario – campos pendientes) </w:t>
-      </w:r>
-    </w:p>
-    <w:p>
-      <w:pPr>
-        <w:numPr>
-          <w:ilvl w:val="0"/>
-          <w:numId w:val="10"/>
-        </w:numPr>
-        <w:spacing w:after="160" w:line="278" w:lineRule="auto"/>
-      </w:pPr>
-      <w:r>
-        <w:rPr>
-          <w:b/>
-          <w:bCs/>
-        </w:rPr>
-        <w:t>RF-13</w:t>
-      </w:r>
-      <w:r>
-        <w:t xml:space="preserve">: El sistema debe permitir actualizar información existente </w:t>
-      </w:r>
-    </w:p>
-    <w:p>
-      <w:pPr>
-        <w:numPr>
-          <w:ilvl w:val="0"/>
-          <w:numId w:val="10"/>
-        </w:numPr>
-        <w:spacing w:after="160" w:line="278" w:lineRule="auto"/>
-      </w:pPr>
-      <w:r>
-        <w:rPr>
-          <w:b/>
-          <w:bCs/>
-        </w:rPr>
-        <w:t>RF-14</w:t>
-      </w:r>
-      <w:r>
-        <w:t xml:space="preserve">: El sistema debe validar permisos antes de permitir la captura </w:t>
-      </w:r>
-    </w:p>
-    <w:p>
-      <w:pPr>
-        <w:numPr>
-          <w:ilvl w:val="0"/>
-          <w:numId w:val="10"/>
-        </w:numPr>
-        <w:spacing w:after="160" w:line="278" w:lineRule="auto"/>
-      </w:pPr>
-      <w:r>
-        <w:rPr>
-          <w:b/>
-          <w:bCs/>
-        </w:rPr>
-        <w:t>RF-15</w:t>
-      </w:r>
-      <w:r>
-        <w:t xml:space="preserve">: El sistema debe mostrar mensaje de restricción cuando el usuario no tenga permisos </w:t>
-      </w:r>
-    </w:p>
-    <w:p>
-      <w:pPr>
-        <w:pStyle w:val="Ttulo3"/>
-      </w:pPr>
-      <w:r>
-        <w:t xml:space="preserve">6.5 </w:t>
-      </w:r>
-      <w:r>
-        <w:t>Visualización del mapa</w:t>
-      </w:r>
-    </w:p>
-    <w:p>
-      <w:pPr>
-        <w:numPr>
-          <w:ilvl w:val="0"/>
-          <w:numId w:val="11"/>
-        </w:numPr>
-        <w:spacing w:after="160" w:line="278" w:lineRule="auto"/>
-      </w:pPr>
-      <w:r>
-        <w:rPr>
-          <w:b/>
-          <w:bCs/>
-        </w:rPr>
-        <w:t>RF-16</w:t>
-      </w:r>
-      <w:r>
-        <w:t xml:space="preserve">: El sistema debe mostrar un mapa con los núcleos agrarios </w:t>
-      </w:r>
-    </w:p>
-    <w:p>
-      <w:pPr>
-        <w:numPr>
-          <w:ilvl w:val="0"/>
-          <w:numId w:val="11"/>
-        </w:numPr>
-        <w:spacing w:after="160" w:line="278" w:lineRule="auto"/>
-      </w:pPr>
-      <w:r>
-        <w:rPr>
-          <w:b/>
-          <w:bCs/>
-        </w:rPr>
-        <w:t>RF-17</w:t>
-      </w:r>
-      <w:r>
-        <w:t xml:space="preserve">: El sistema debe mostrar el trazo del tren sobre el mapa </w:t>
-      </w:r>
-    </w:p>
-    <w:p>
-      <w:pPr>
-        <w:numPr>
-          <w:ilvl w:val="0"/>
-          <w:numId w:val="11"/>
-        </w:numPr>
-        <w:spacing w:after="160" w:line="278" w:lineRule="auto"/>
-      </w:pPr>
-      <w:r>
-        <w:rPr>
-          <w:b/>
-          <w:bCs/>
-        </w:rPr>
-        <w:t>RF-18</w:t>
-      </w:r>
-      <w:r>
-        <w:t xml:space="preserve">: El sistema debe colorear el tramo según el estado del núcleo </w:t>
-      </w:r>
-    </w:p>
-    <w:p>
-      <w:pPr>
-        <w:numPr>
-          <w:ilvl w:val="0"/>
-          <w:numId w:val="11"/>
-        </w:numPr>
-        <w:spacing w:after="160" w:line="278" w:lineRule="auto"/>
-      </w:pPr>
-      <w:r>
-        <w:rPr>
-          <w:b/>
-          <w:bCs/>
-        </w:rPr>
-        <w:lastRenderedPageBreak/>
-        <w:t>RF-19</w:t>
-      </w:r>
-      <w:r>
-        <w:t xml:space="preserve">: El sistema debe permitir seleccionar un núcleo agrario en el mapa </w:t>
-      </w:r>
-    </w:p>
-    <w:p>
-      <w:pPr>
-        <w:numPr>
-          <w:ilvl w:val="0"/>
-          <w:numId w:val="11"/>
-        </w:numPr>
-        <w:spacing w:after="160" w:line="278" w:lineRule="auto"/>
-      </w:pPr>
-      <w:r>
-        <w:rPr>
-          <w:b/>
-          <w:bCs/>
-        </w:rPr>
-        <w:t>RF-20</w:t>
-      </w:r>
-      <w:r>
-        <w:t xml:space="preserve">: El sistema debe mostrar información del núcleo seleccionado </w:t>
-      </w:r>
-    </w:p>
-    <w:p>
-      <w:pPr>
-        <w:spacing w:after="160" w:line="278" w:lineRule="auto"/>
-        <w:ind w:left="720"/>
-      </w:pPr>
-    </w:p>
-    <w:p>
-      <w:pPr>
-        <w:pStyle w:val="Ttulo3"/>
-        <w:ind w:left="720" w:hanging="720"/>
-      </w:pPr>
-      <w:r>
-        <w:t xml:space="preserve">6.6 </w:t>
-      </w:r>
-      <w:r>
-        <w:t>Reportes</w:t>
-      </w:r>
-    </w:p>
-    <w:p>
-      <w:pPr>
-        <w:numPr>
-          <w:ilvl w:val="0"/>
-          <w:numId w:val="12"/>
-        </w:numPr>
-        <w:spacing w:after="160" w:line="278" w:lineRule="auto"/>
-      </w:pPr>
-      <w:r>
-        <w:rPr>
-          <w:b/>
-          <w:bCs/>
-        </w:rPr>
-        <w:t>RF-21</w:t>
-      </w:r>
-      <w:r>
-        <w:t xml:space="preserve">: El sistema debe generar reportes de avance por núcleo agrario </w:t>
-      </w:r>
-    </w:p>
-    <w:p>
-      <w:pPr>
-        <w:numPr>
-          <w:ilvl w:val="0"/>
-          <w:numId w:val="12"/>
-        </w:numPr>
-        <w:spacing w:after="160" w:line="278" w:lineRule="auto"/>
-      </w:pPr>
-      <w:r>
-        <w:rPr>
-          <w:b/>
-          <w:bCs/>
-        </w:rPr>
-        <w:t>RF-22</w:t>
-      </w:r>
-      <w:r>
-        <w:t xml:space="preserve">: El sistema debe mostrar gráficas de distribución (ej. tipo de propiedad) </w:t>
-      </w:r>
-    </w:p>
-    <w:p>
-      <w:pPr>
-        <w:numPr>
-          <w:ilvl w:val="0"/>
-          <w:numId w:val="12"/>
-        </w:numPr>
-        <w:spacing w:after="160" w:line="278" w:lineRule="auto"/>
-      </w:pPr>
-      <w:r>
-        <w:rPr>
-          <w:b/>
-          <w:bCs/>
-        </w:rPr>
-        <w:t>RF-23</w:t>
-      </w:r>
-      <w:r>
-        <w:t xml:space="preserve">: El sistema debe permitir exportar reportes en formato: </w:t>
-      </w:r>
-    </w:p>
-    <w:p>
-      <w:pPr>
-        <w:numPr>
-          <w:ilvl w:val="1"/>
-          <w:numId w:val="12"/>
-        </w:numPr>
-        <w:spacing w:after="160" w:line="278" w:lineRule="auto"/>
-      </w:pPr>
-      <w:r>
-        <w:t xml:space="preserve">XLSX </w:t>
-      </w:r>
-    </w:p>
-    <w:p>
-      <w:pPr>
-        <w:numPr>
-          <w:ilvl w:val="1"/>
-          <w:numId w:val="12"/>
-        </w:numPr>
-        <w:spacing w:after="160" w:line="278" w:lineRule="auto"/>
-      </w:pPr>
-      <w:r>
-        <w:t xml:space="preserve">PDF (opcional en esta fase) </w:t>
-      </w:r>
-    </w:p>
-    <w:p>
-      <w:pPr>
-        <w:spacing w:after="160" w:line="278" w:lineRule="auto"/>
-      </w:pPr>
-    </w:p>
-    <w:p>
-      <w:r>
-        <w:pict w14:anchorId="3D0486BF">
-          <v:rect id="_x0000_i1030" style="width:0;height:1.5pt" o:hralign="center" o:hrstd="t" o:hr="t" fillcolor="#a0a0a0" stroked="f"/>
-        </w:pict>
-      </w:r>
-    </w:p>
-    <w:p>
-      <w:pPr>
-        <w:pStyle w:val="Ttulo2"/>
-      </w:pPr>
-      <w:bookmarkStart w:id="21" w:name="_bcvftnms1l62" w:colFirst="0" w:colLast="0"/>
-      <w:bookmarkEnd w:id="21"/>
-      <w:r>
-        <w:t>7. Requerimientos No Funcionales (RNF)</w:t>
-      </w:r>
-    </w:p>
-    <w:p>
-      <w:pPr>
-        <w:numPr>
-          <w:ilvl w:val="0"/>
-          <w:numId w:val="2"/>
-        </w:numPr>
-        <w:spacing w:line="360" w:lineRule="auto"/>
-        <w:jc w:val="both"/>
-      </w:pPr>
-      <w:r>
-        <w:rPr>
-          <w:b/>
-          <w:bCs/>
-        </w:rPr>
-        <w:t>RNF-01 Seguridad:</w:t>
-      </w:r>
-      <w:r>
-        <w:t xml:space="preserve"> El sistema debe bloquear cualquier intento de acceso a datos o funciones no permitidas por el rol del usuario, emitiendo un mensaje de restricción.</w:t>
-      </w:r>
-    </w:p>
-    <w:p>
-      <w:pPr>
-        <w:numPr>
-          <w:ilvl w:val="0"/>
-          <w:numId w:val="2"/>
-        </w:numPr>
-        <w:spacing w:line="360" w:lineRule="auto"/>
-        <w:jc w:val="both"/>
-      </w:pPr>
-      <w:r>
-        <w:rPr>
-          <w:b/>
-          <w:bCs/>
-        </w:rPr>
-        <w:t>RNF-02 Usabilidad:</w:t>
-      </w:r>
-      <w:r>
-        <w:t xml:space="preserve"> El mapa interactivo será de visualización estándar; no contará con funcionalidades de </w:t>
-      </w:r>
-      <w:proofErr w:type="gramStart"/>
-      <w:r>
-        <w:t>zoom</w:t>
-      </w:r>
-      <w:proofErr w:type="gramEnd"/>
-      <w:r>
-        <w:t xml:space="preserve"> libre o edición manual de la geometría por parte del usuario final para mantener la integridad del reporte.</w:t>
-      </w:r>
-    </w:p>
-    <w:p>
-      <w:pPr>
-        <w:numPr>
-          <w:ilvl w:val="0"/>
-          <w:numId w:val="2"/>
-        </w:numPr>
-        <w:spacing w:line="360" w:lineRule="auto"/>
-        <w:jc w:val="both"/>
-      </w:pPr>
-      <w:r>
-        <w:rPr>
-          <w:b/>
-          <w:bCs/>
-        </w:rPr>
-        <w:t>RNF-03 Persistencia:</w:t>
-      </w:r>
-      <w:r>
-        <w:t xml:space="preserve"> Toda la información capturada debe almacenarse de forma íntegra en la base de datos central para asegurar la consistencia de los reportes.</w:t>
-      </w:r>
-    </w:p>
-    <w:p>
-      <w:pPr>
-        <w:numPr>
-          <w:ilvl w:val="0"/>
-          <w:numId w:val="2"/>
-        </w:numPr>
-        <w:spacing w:line="360" w:lineRule="auto"/>
-        <w:jc w:val="both"/>
-      </w:pPr>
-      <w:r>
-        <w:rPr>
-          <w:b/>
-          <w:bCs/>
-        </w:rPr>
-        <w:t>RNF-04 Escalabilidad:</w:t>
-      </w:r>
-      <w:r>
-        <w:t xml:space="preserve"> La arquitectura debe permitir la incorporación futura de exportación en formato PDF y reportes detallados por parcelas individuales.</w:t>
+        <w:t>, Operador, Analista) con los módulos de mapa, formularios de captura y generador de reportes.</w:t>
       </w:r>
     </w:p>
     <w:p>
@@ -2524,167 +2786,7 @@
         </w:pBdr>
       </w:pPr>
     </w:p>
-    <w:p>
-      <w:r>
-        <w:pict w14:anchorId="71B2255A">
-          <v:rect id="_x0000_i1031" style="width:0;height:1.5pt" o:hralign="center" o:hrstd="t" o:hr="t" fillcolor="#a0a0a0" stroked="f"/>
-        </w:pict>
-      </w:r>
-    </w:p>
-    <w:p>
-      <w:pPr>
-        <w:pStyle w:val="Ttulo2"/>
-      </w:pPr>
-      <w:bookmarkStart w:id="22" w:name="_dihqeme2cigd" w:colFirst="0" w:colLast="0"/>
-      <w:bookmarkEnd w:id="22"/>
-      <w:r>
-        <w:t>8. Modelos del Sistema</w:t>
-      </w:r>
-    </w:p>
-    <w:p>
-      <w:pPr>
-        <w:pStyle w:val="Ttulo3"/>
-      </w:pPr>
-      <w:bookmarkStart w:id="23" w:name="_kc3jw8d7mlns" w:colFirst="0" w:colLast="0"/>
-      <w:bookmarkEnd w:id="23"/>
-      <w:r>
-        <w:t>8.1 Modelo de Datos (Sugerencia)</w:t>
-      </w:r>
-    </w:p>
-    <w:p>
-      <w:r>
-        <w:t xml:space="preserve">El modelo debe centrarse en la entidad </w:t>
-      </w:r>
-      <w:r>
-        <w:rPr>
-          <w:b/>
-          <w:bCs/>
-        </w:rPr>
-        <w:t>Núcleo Agrario</w:t>
-      </w:r>
-      <w:r>
-        <w:t>, la cual se vincula con:</w:t>
-      </w:r>
-    </w:p>
-    <w:p>
-      <w:pPr>
-        <w:widowControl w:val="0"/>
-        <w:pBdr>
-          <w:top w:val="nil"/>
-          <w:left w:val="nil"/>
-          <w:bottom w:val="nil"/>
-          <w:right w:val="nil"/>
-          <w:between w:val="nil"/>
-        </w:pBdr>
-      </w:pPr>
-    </w:p>
-    <w:p>
-      <w:pPr>
-        <w:numPr>
-          <w:ilvl w:val="0"/>
-          <w:numId w:val="2"/>
-        </w:numPr>
-      </w:pPr>
-      <w:r>
-        <w:rPr>
-          <w:b/>
-          <w:bCs/>
-        </w:rPr>
-        <w:t>Asambleas:</w:t>
-      </w:r>
-      <w:r>
-        <w:t xml:space="preserve"> Relación uno a muchos para registrar el historial legal.</w:t>
-      </w:r>
-    </w:p>
-    <w:p>
-      <w:pPr>
-        <w:numPr>
-          <w:ilvl w:val="0"/>
-          <w:numId w:val="2"/>
-        </w:numPr>
-      </w:pPr>
-      <w:r>
-        <w:rPr>
-          <w:b/>
-          <w:bCs/>
-        </w:rPr>
-        <w:lastRenderedPageBreak/>
-        <w:t>Segmentos de Tramo:</w:t>
-      </w:r>
-      <w:r>
-        <w:t xml:space="preserve"> Relación uno a muchos que define qué partes de la línea ferroviaria atraviesan cada núcleo.</w:t>
-      </w:r>
-    </w:p>
-    <w:p>
-      <w:pPr>
-        <w:numPr>
-          <w:ilvl w:val="0"/>
-          <w:numId w:val="2"/>
-        </w:numPr>
-      </w:pPr>
-      <w:r>
-        <w:rPr>
-          <w:b/>
-          <w:bCs/>
-        </w:rPr>
-        <w:t>Atributos Geográficos:</w:t>
-      </w:r>
-      <w:r>
-        <w:t xml:space="preserve"> Uso de tipos de datos espaciales (Polígonos para núcleos, Líneas para tramos).</w:t>
-      </w:r>
-    </w:p>
-    <w:p>
-      <w:pPr>
-        <w:pStyle w:val="Ttulo3"/>
-      </w:pPr>
-      <w:bookmarkStart w:id="24" w:name="_y2np0f4uv3fy" w:colFirst="0" w:colLast="0"/>
-      <w:bookmarkEnd w:id="24"/>
-      <w:r>
-        <w:t>8.2 Modelo de Comportamiento</w:t>
-      </w:r>
-    </w:p>
-    <w:p>
-      <w:r>
-        <w:t xml:space="preserve">Se recomienda el uso de </w:t>
-      </w:r>
-      <w:r>
-        <w:rPr>
-          <w:b/>
-          <w:bCs/>
-        </w:rPr>
-        <w:t>Diagramas de Casos de Uso</w:t>
-      </w:r>
-      <w:r>
-        <w:t xml:space="preserve"> de UML para modelar las interacciones de los tres roles (</w:t>
-      </w:r>
-      <w:proofErr w:type="spellStart"/>
-      <w:r>
-        <w:t>Admin</w:t>
-      </w:r>
-      <w:proofErr w:type="spellEnd"/>
-      <w:r>
-        <w:t>, Operador, Analista) con los módulos de mapa, formularios de captura y generador de reportes.</w:t>
-      </w:r>
-    </w:p>
-    <w:p>
-      <w:pPr>
-        <w:widowControl w:val="0"/>
-        <w:pBdr>
-          <w:top w:val="nil"/>
-          <w:left w:val="nil"/>
-          <w:bottom w:val="nil"/>
-          <w:right w:val="nil"/>
-          <w:between w:val="nil"/>
-        </w:pBdr>
-      </w:pPr>
-    </w:p>
-    <w:p>
-      <w:r>
-        <w:pict w14:anchorId="5A4FD0F9">
-          <v:rect id="_x0000_i1032" style="width:0;height:1.5pt" o:hralign="center" o:hrstd="t" o:hr="t" fillcolor="#a0a0a0" stroked="f"/>
-        </w:pict>
-      </w:r>
-    </w:p>
+    <w:p/>
     <w:p>
       <w:bookmarkStart w:id="25" w:name="_p3pa7hk3dtgs" w:colFirst="0" w:colLast="0"/>
       <w:bookmarkStart w:id="26" w:name="_kst77mpj2ef8" w:colFirst="0" w:colLast="0"/>
@@ -2692,11 +2794,13 @@
       <w:bookmarkEnd w:id="26"/>
     </w:p>
     <w:sectPr>
-      <w:footerReference w:type="default" r:id="rId7"/>
+      <w:footerReference w:type="first" r:id="rId8"/>
       <w:pgSz w:w="12240" w:h="15840"/>
       <w:pgMar w:top="1440" w:right="1440" w:bottom="1440" w:left="1440" w:header="0" w:footer="720" w:gutter="0"/>
       <w:pgNumType w:start="1"/>
       <w:cols w:space="720"/>
+      <w:titlePg/>
+      <w:docGrid w:linePitch="299"/>
     </w:sectPr>
   </w:body>
 </w:document>
@@ -5760,4 +5864,16 @@
   </a:objectDefaults>
   <a:extraClrSchemeLst/>
 </a:theme>
+</file>
+
+<file path=customXml/item1.xml><?xml version="1.0" encoding="utf-8"?>
+<b:Sources xmlns:b="http://schemas.openxmlformats.org/officeDocument/2006/bibliography" xmlns="http://schemas.openxmlformats.org/officeDocument/2006/bibliography" SelectedStyle="\APASixthEditionOfficeOnline.xsl" StyleName="APA" Version="6"/>
+</file>
+
+<file path=customXml/itemProps1.xml><?xml version="1.0" encoding="utf-8"?>
+<ds:datastoreItem xmlns:ds="http://schemas.openxmlformats.org/officeDocument/2006/customXml" ds:itemID="{67A8D644-A798-45E1-92AD-C89EF749E8BE}">
+  <ds:schemaRefs>
+    <ds:schemaRef ds:uri="http://schemas.openxmlformats.org/officeDocument/2006/bibliography"/>
+  </ds:schemaRefs>
+</ds:datastoreItem>
 </file>
</xml_diff>